<commit_message>
Shto versionin nëntë-minutësh të prezantimit
Të njëjtat sllajde me tekst folës më të gjatë; fleta mban seancën nga agjenda dhe kohën e të dy versioneve.
</commit_message>
<xml_diff>
--- a/docs/konferenca/UBT2026_pergatitja.docx
+++ b/docs/konferenca/UBT2026_pergatitja.docx
@@ -30,7 +30,7 @@
         <w:pStyle w:val="ListBullet"/>
       </w:pPr>
       <w:r>
-        <w:t>Konferenca e 15-të Ndërkombëtare e UBT-së, nënkonferenca IC-CSCE (Computer Science and Communication Engineering), 23–25 tetor 2026, UBT SMART City – Science and Innovation Park (conferences.ubt-uni.net).</w:t>
+        <w:t>15th UBT Annual International Conference on Computer Science and Engineering, 23–25 tetor 2026. Ceremonia e hapjes është të premten, 23 tetor, në UBT Innovation Campus – Lipjan. Prezantimi mund të mbahet fizikisht ose online.</w:t>
       </w:r>
     </w:p>
     <w:p>
@@ -38,7 +38,7 @@
         <w:pStyle w:val="ListBullet"/>
       </w:pPr>
       <w:r>
-        <w:t>Më 2025 nënkonferenca kishte seancat «Software Engineering» (9 prezantime), «Artificial Intelligence» (8) dhe «Network Communications and Security» (6), secila me kryesues dhe bashkëkryesues, plus një seancë postere. Mentorja jote prezantoi atje «The Use of Artificial Intelligence for Fake News Detection».</w:t>
+        <w:t>Seanca jote: «Session 1 – Software Engineering», e shtunë 24 tetor, 09:00–11:00, salla I-302 në UBT Campus. Kryesues Blerim Zylifu, bashkëkryesues Lavdim Menxhiqi.</w:t>
       </w:r>
     </w:p>
     <w:p>
@@ -46,7 +46,23 @@
         <w:pStyle w:val="ListBullet"/>
       </w:pPr>
       <w:r>
-        <w:t>Agjenda e një nënkonference motër më 2025 kishte vende prej 10–12 minutash për prezantim. Teksti i përgatitur zgjat rreth 7 minuta me ritëm të qetë, dhe me pauzat e kalimet rreth 8: mbetet kohë rezervë para kufirit të 10 minutave.</w:t>
+        <w:t>Je i 14-ti nga 17 prezantime në seancë. Email-i thotë 10 minuta për prezantim, por 17 prezantime në 120 minuta lënë rreth 7 për secilin. Prandaj ke dy versione, dhe zgjedh njërin sipas kohës që jep kryesuesi.</w:t>
+      </w:r>
+    </w:p>
+    <w:p>
+      <w:pPr>
+        <w:pStyle w:val="ListBullet"/>
+      </w:pPr>
+      <w:r>
+        <w:t>Në të njëjtën seancë ka tri punime për kodin dhe modelet gjuhësore: optimizimi i kodit Java me LLM, besueshmëria e kodit të gjeneruar nga AI, dhe punimi i mentores «Trust but Verify». Pyetja «pse jo një LLM?» ka gjasa të dalë; përgjigjen e ke më poshtë.</w:t>
+      </w:r>
+    </w:p>
+    <w:p>
+      <w:pPr>
+        <w:pStyle w:val="ListBullet"/>
+      </w:pPr>
+      <w:r>
+        <w:t>Agjenda përfundimtare vjen të mërkurën, 21 tetor: kontrollo radhën, orën dhe sallën.</w:t>
       </w:r>
     </w:p>
     <w:p>
@@ -62,12 +78,52 @@
         <w:pStyle w:val="Heading1"/>
       </w:pPr>
       <w:r>
+        <w:t>Dy versione</w:t>
+      </w:r>
+    </w:p>
+    <w:p>
+      <w:pPr>
+        <w:pStyle w:val="ListBullet"/>
+      </w:pPr>
+      <w:r>
+        <w:t>UBT2026_Florent_Latifi.pptx: versioni i shkurtër, 811 fjalë, rreth 7:03 me ritëm të qetë. Për rastin kur kryesuesi jep 7 minuta ose më pak.</w:t>
+      </w:r>
+    </w:p>
+    <w:p>
+      <w:pPr>
+        <w:pStyle w:val="ListBullet"/>
+      </w:pPr>
+      <w:r>
+        <w:t>UBT2026_Florent_Latifi_9min.pptx: versioni i gjatë, 1085 fjalë, rreth 9:26 me ritëm të qetë. Për rastin kur jep vërtet 10 minuta, siç thotë email-i.</w:t>
+      </w:r>
+    </w:p>
+    <w:p>
+      <w:pPr>
+        <w:pStyle w:val="ListBullet"/>
+      </w:pPr>
+      <w:r>
+        <w:t>Sllajdet janë të njëjta; ndryshon vetëm teksti folës. I gjati është i shkurtri plus disa fjali shtesë, që te shënimet e PowerPoint-it janë me shkronja të pjerrëta e këtu më poshtë me të gjelbër: kur koha nuk mjafton, i lë dhe je te versioni i shkurtër pa humbur fillin.</w:t>
+      </w:r>
+    </w:p>
+    <w:p>
+      <w:pPr>
+        <w:pStyle w:val="ListBullet"/>
+      </w:pPr>
+      <w:r>
+        <w:t>Me ritëm të shpejtë (145 fjalë në minutë) i shkurtri zgjat 5:36 dhe i gjati 7:29, pa pauzat. Ky ritëm është supozim. Për ta matur tëndin, lexo me zë tekstin e sllajdit 2 me kronometër: fjalët e tij (te tabela) pjesëtuar me minutat janë ritmi yt.</w:t>
+      </w:r>
+    </w:p>
+    <w:p>
+      <w:pPr>
+        <w:pStyle w:val="Heading1"/>
+      </w:pPr>
+      <w:r>
         <w:t>Koha për sllajd</w:t>
       </w:r>
     </w:p>
     <w:p>
       <w:r>
-        <w:t>E llogaritur nga fjalët e shënimeve folëse, me 115 fjalë në minutë.</w:t>
+        <w:t>E llogaritur nga fjalët e shënimeve folëse, me 115 fjalë në minutë, pa pauzat dhe kalimet mes sllajdeve (zakonisht edhe rreth një minutë gjithsej).</w:t>
       </w:r>
     </w:p>
     <w:tbl>
@@ -77,15 +133,18 @@
         <w:tblLook w:firstColumn="1" w:firstRow="1" w:lastColumn="0" w:lastRow="0" w:noHBand="0" w:noVBand="1" w:val="04A0"/>
       </w:tblPr>
       <w:tblGrid>
-        <w:gridCol w:w="2160"/>
-        <w:gridCol w:w="2160"/>
-        <w:gridCol w:w="2160"/>
-        <w:gridCol w:w="2160"/>
+        <w:gridCol w:w="1234"/>
+        <w:gridCol w:w="1234"/>
+        <w:gridCol w:w="1234"/>
+        <w:gridCol w:w="1234"/>
+        <w:gridCol w:w="1234"/>
+        <w:gridCol w:w="1234"/>
+        <w:gridCol w:w="1234"/>
       </w:tblGrid>
       <w:tr>
         <w:tc>
           <w:tcPr>
-            <w:tcW w:type="dxa" w:w="2160"/>
+            <w:tcW w:type="dxa" w:w="1234"/>
           </w:tcPr>
           <w:p>
             <w:r>
@@ -95,7 +154,7 @@
         </w:tc>
         <w:tc>
           <w:tcPr>
-            <w:tcW w:type="dxa" w:w="2160"/>
+            <w:tcW w:type="dxa" w:w="1234"/>
           </w:tcPr>
           <w:p>
             <w:r>
@@ -105,21 +164,51 @@
         </w:tc>
         <w:tc>
           <w:tcPr>
-            <w:tcW w:type="dxa" w:w="2160"/>
+            <w:tcW w:type="dxa" w:w="1234"/>
           </w:tcPr>
           <w:p>
             <w:r>
-              <w:t>Sekonda</w:t>
+              <w:t>Fjalë</w:t>
             </w:r>
           </w:p>
         </w:tc>
         <w:tc>
           <w:tcPr>
-            <w:tcW w:type="dxa" w:w="2160"/>
+            <w:tcW w:type="dxa" w:w="1234"/>
           </w:tcPr>
           <w:p>
             <w:r>
-              <w:t>Gjithsej</w:t>
+              <w:t>Shkurt: sek.</w:t>
+            </w:r>
+          </w:p>
+        </w:tc>
+        <w:tc>
+          <w:tcPr>
+            <w:tcW w:type="dxa" w:w="1234"/>
+          </w:tcPr>
+          <w:p>
+            <w:r>
+              <w:t>Shkurt: gjithsej</w:t>
+            </w:r>
+          </w:p>
+        </w:tc>
+        <w:tc>
+          <w:tcPr>
+            <w:tcW w:type="dxa" w:w="1234"/>
+          </w:tcPr>
+          <w:p>
+            <w:r>
+              <w:t>9 min: sek.</w:t>
+            </w:r>
+          </w:p>
+        </w:tc>
+        <w:tc>
+          <w:tcPr>
+            <w:tcW w:type="dxa" w:w="1234"/>
+          </w:tcPr>
+          <w:p>
+            <w:r>
+              <w:t>9 min: gjithsej</w:t>
             </w:r>
           </w:p>
         </w:tc>
@@ -127,7 +216,7 @@
       <w:tr>
         <w:tc>
           <w:tcPr>
-            <w:tcW w:type="dxa" w:w="2160"/>
+            <w:tcW w:type="dxa" w:w="1234"/>
           </w:tcPr>
           <w:p>
             <w:r>
@@ -137,7 +226,7 @@
         </w:tc>
         <w:tc>
           <w:tcPr>
-            <w:tcW w:type="dxa" w:w="2160"/>
+            <w:tcW w:type="dxa" w:w="1234"/>
           </w:tcPr>
           <w:p>
             <w:r>
@@ -147,7 +236,17 @@
         </w:tc>
         <w:tc>
           <w:tcPr>
-            <w:tcW w:type="dxa" w:w="2160"/>
+            <w:tcW w:type="dxa" w:w="1234"/>
+          </w:tcPr>
+          <w:p>
+            <w:r>
+              <w:t>54</w:t>
+            </w:r>
+          </w:p>
+        </w:tc>
+        <w:tc>
+          <w:tcPr>
+            <w:tcW w:type="dxa" w:w="1234"/>
           </w:tcPr>
           <w:p>
             <w:r>
@@ -157,7 +256,27 @@
         </w:tc>
         <w:tc>
           <w:tcPr>
-            <w:tcW w:type="dxa" w:w="2160"/>
+            <w:tcW w:type="dxa" w:w="1234"/>
+          </w:tcPr>
+          <w:p>
+            <w:r>
+              <w:t>0:28</w:t>
+            </w:r>
+          </w:p>
+        </w:tc>
+        <w:tc>
+          <w:tcPr>
+            <w:tcW w:type="dxa" w:w="1234"/>
+          </w:tcPr>
+          <w:p>
+            <w:r>
+              <w:t>28</w:t>
+            </w:r>
+          </w:p>
+        </w:tc>
+        <w:tc>
+          <w:tcPr>
+            <w:tcW w:type="dxa" w:w="1234"/>
           </w:tcPr>
           <w:p>
             <w:r>
@@ -169,7 +288,7 @@
       <w:tr>
         <w:tc>
           <w:tcPr>
-            <w:tcW w:type="dxa" w:w="2160"/>
+            <w:tcW w:type="dxa" w:w="1234"/>
           </w:tcPr>
           <w:p>
             <w:r>
@@ -179,7 +298,7 @@
         </w:tc>
         <w:tc>
           <w:tcPr>
-            <w:tcW w:type="dxa" w:w="2160"/>
+            <w:tcW w:type="dxa" w:w="1234"/>
           </w:tcPr>
           <w:p>
             <w:r>
@@ -189,7 +308,17 @@
         </w:tc>
         <w:tc>
           <w:tcPr>
-            <w:tcW w:type="dxa" w:w="2160"/>
+            <w:tcW w:type="dxa" w:w="1234"/>
+          </w:tcPr>
+          <w:p>
+            <w:r>
+              <w:t>117</w:t>
+            </w:r>
+          </w:p>
+        </w:tc>
+        <w:tc>
+          <w:tcPr>
+            <w:tcW w:type="dxa" w:w="1234"/>
           </w:tcPr>
           <w:p>
             <w:r>
@@ -199,7 +328,27 @@
         </w:tc>
         <w:tc>
           <w:tcPr>
-            <w:tcW w:type="dxa" w:w="2160"/>
+            <w:tcW w:type="dxa" w:w="1234"/>
+          </w:tcPr>
+          <w:p>
+            <w:r>
+              <w:t>1:29</w:t>
+            </w:r>
+          </w:p>
+        </w:tc>
+        <w:tc>
+          <w:tcPr>
+            <w:tcW w:type="dxa" w:w="1234"/>
+          </w:tcPr>
+          <w:p>
+            <w:r>
+              <w:t>61</w:t>
+            </w:r>
+          </w:p>
+        </w:tc>
+        <w:tc>
+          <w:tcPr>
+            <w:tcW w:type="dxa" w:w="1234"/>
           </w:tcPr>
           <w:p>
             <w:r>
@@ -211,7 +360,7 @@
       <w:tr>
         <w:tc>
           <w:tcPr>
-            <w:tcW w:type="dxa" w:w="2160"/>
+            <w:tcW w:type="dxa" w:w="1234"/>
           </w:tcPr>
           <w:p>
             <w:r>
@@ -221,7 +370,7 @@
         </w:tc>
         <w:tc>
           <w:tcPr>
-            <w:tcW w:type="dxa" w:w="2160"/>
+            <w:tcW w:type="dxa" w:w="1234"/>
           </w:tcPr>
           <w:p>
             <w:r>
@@ -231,7 +380,17 @@
         </w:tc>
         <w:tc>
           <w:tcPr>
-            <w:tcW w:type="dxa" w:w="2160"/>
+            <w:tcW w:type="dxa" w:w="1234"/>
+          </w:tcPr>
+          <w:p>
+            <w:r>
+              <w:t>106 / 129</w:t>
+            </w:r>
+          </w:p>
+        </w:tc>
+        <w:tc>
+          <w:tcPr>
+            <w:tcW w:type="dxa" w:w="1234"/>
           </w:tcPr>
           <w:p>
             <w:r>
@@ -241,11 +400,31 @@
         </w:tc>
         <w:tc>
           <w:tcPr>
-            <w:tcW w:type="dxa" w:w="2160"/>
+            <w:tcW w:type="dxa" w:w="1234"/>
           </w:tcPr>
           <w:p>
             <w:r>
-              <w:t>2:24</w:t>
+              <w:t>2:25</w:t>
+            </w:r>
+          </w:p>
+        </w:tc>
+        <w:tc>
+          <w:tcPr>
+            <w:tcW w:type="dxa" w:w="1234"/>
+          </w:tcPr>
+          <w:p>
+            <w:r>
+              <w:t>67</w:t>
+            </w:r>
+          </w:p>
+        </w:tc>
+        <w:tc>
+          <w:tcPr>
+            <w:tcW w:type="dxa" w:w="1234"/>
+          </w:tcPr>
+          <w:p>
+            <w:r>
+              <w:t>2:37</w:t>
             </w:r>
           </w:p>
         </w:tc>
@@ -253,7 +432,7 @@
       <w:tr>
         <w:tc>
           <w:tcPr>
-            <w:tcW w:type="dxa" w:w="2160"/>
+            <w:tcW w:type="dxa" w:w="1234"/>
           </w:tcPr>
           <w:p>
             <w:r>
@@ -263,7 +442,7 @@
         </w:tc>
         <w:tc>
           <w:tcPr>
-            <w:tcW w:type="dxa" w:w="2160"/>
+            <w:tcW w:type="dxa" w:w="1234"/>
           </w:tcPr>
           <w:p>
             <w:r>
@@ -273,7 +452,17 @@
         </w:tc>
         <w:tc>
           <w:tcPr>
-            <w:tcW w:type="dxa" w:w="2160"/>
+            <w:tcW w:type="dxa" w:w="1234"/>
+          </w:tcPr>
+          <w:p>
+            <w:r>
+              <w:t>102 / 144</w:t>
+            </w:r>
+          </w:p>
+        </w:tc>
+        <w:tc>
+          <w:tcPr>
+            <w:tcW w:type="dxa" w:w="1234"/>
           </w:tcPr>
           <w:p>
             <w:r>
@@ -283,11 +472,31 @@
         </w:tc>
         <w:tc>
           <w:tcPr>
-            <w:tcW w:type="dxa" w:w="2160"/>
+            <w:tcW w:type="dxa" w:w="1234"/>
           </w:tcPr>
           <w:p>
             <w:r>
-              <w:t>3:17</w:t>
+              <w:t>3:18</w:t>
+            </w:r>
+          </w:p>
+        </w:tc>
+        <w:tc>
+          <w:tcPr>
+            <w:tcW w:type="dxa" w:w="1234"/>
+          </w:tcPr>
+          <w:p>
+            <w:r>
+              <w:t>75</w:t>
+            </w:r>
+          </w:p>
+        </w:tc>
+        <w:tc>
+          <w:tcPr>
+            <w:tcW w:type="dxa" w:w="1234"/>
+          </w:tcPr>
+          <w:p>
+            <w:r>
+              <w:t>3:52</w:t>
             </w:r>
           </w:p>
         </w:tc>
@@ -295,7 +504,7 @@
       <w:tr>
         <w:tc>
           <w:tcPr>
-            <w:tcW w:type="dxa" w:w="2160"/>
+            <w:tcW w:type="dxa" w:w="1234"/>
           </w:tcPr>
           <w:p>
             <w:r>
@@ -305,7 +514,7 @@
         </w:tc>
         <w:tc>
           <w:tcPr>
-            <w:tcW w:type="dxa" w:w="2160"/>
+            <w:tcW w:type="dxa" w:w="1234"/>
           </w:tcPr>
           <w:p>
             <w:r>
@@ -315,7 +524,17 @@
         </w:tc>
         <w:tc>
           <w:tcPr>
-            <w:tcW w:type="dxa" w:w="2160"/>
+            <w:tcW w:type="dxa" w:w="1234"/>
+          </w:tcPr>
+          <w:p>
+            <w:r>
+              <w:t>92 / 124</w:t>
+            </w:r>
+          </w:p>
+        </w:tc>
+        <w:tc>
+          <w:tcPr>
+            <w:tcW w:type="dxa" w:w="1234"/>
           </w:tcPr>
           <w:p>
             <w:r>
@@ -325,11 +544,31 @@
         </w:tc>
         <w:tc>
           <w:tcPr>
-            <w:tcW w:type="dxa" w:w="2160"/>
+            <w:tcW w:type="dxa" w:w="1234"/>
           </w:tcPr>
           <w:p>
             <w:r>
-              <w:t>4:05</w:t>
+              <w:t>4:06</w:t>
+            </w:r>
+          </w:p>
+        </w:tc>
+        <w:tc>
+          <w:tcPr>
+            <w:tcW w:type="dxa" w:w="1234"/>
+          </w:tcPr>
+          <w:p>
+            <w:r>
+              <w:t>65</w:t>
+            </w:r>
+          </w:p>
+        </w:tc>
+        <w:tc>
+          <w:tcPr>
+            <w:tcW w:type="dxa" w:w="1234"/>
+          </w:tcPr>
+          <w:p>
+            <w:r>
+              <w:t>4:56</w:t>
             </w:r>
           </w:p>
         </w:tc>
@@ -337,7 +576,7 @@
       <w:tr>
         <w:tc>
           <w:tcPr>
-            <w:tcW w:type="dxa" w:w="2160"/>
+            <w:tcW w:type="dxa" w:w="1234"/>
           </w:tcPr>
           <w:p>
             <w:r>
@@ -347,7 +586,7 @@
         </w:tc>
         <w:tc>
           <w:tcPr>
-            <w:tcW w:type="dxa" w:w="2160"/>
+            <w:tcW w:type="dxa" w:w="1234"/>
           </w:tcPr>
           <w:p>
             <w:r>
@@ -357,7 +596,17 @@
         </w:tc>
         <w:tc>
           <w:tcPr>
-            <w:tcW w:type="dxa" w:w="2160"/>
+            <w:tcW w:type="dxa" w:w="1234"/>
+          </w:tcPr>
+          <w:p>
+            <w:r>
+              <w:t>81 / 107</w:t>
+            </w:r>
+          </w:p>
+        </w:tc>
+        <w:tc>
+          <w:tcPr>
+            <w:tcW w:type="dxa" w:w="1234"/>
           </w:tcPr>
           <w:p>
             <w:r>
@@ -367,11 +616,31 @@
         </w:tc>
         <w:tc>
           <w:tcPr>
-            <w:tcW w:type="dxa" w:w="2160"/>
+            <w:tcW w:type="dxa" w:w="1234"/>
           </w:tcPr>
           <w:p>
             <w:r>
-              <w:t>4:47</w:t>
+              <w:t>4:48</w:t>
+            </w:r>
+          </w:p>
+        </w:tc>
+        <w:tc>
+          <w:tcPr>
+            <w:tcW w:type="dxa" w:w="1234"/>
+          </w:tcPr>
+          <w:p>
+            <w:r>
+              <w:t>56</w:t>
+            </w:r>
+          </w:p>
+        </w:tc>
+        <w:tc>
+          <w:tcPr>
+            <w:tcW w:type="dxa" w:w="1234"/>
+          </w:tcPr>
+          <w:p>
+            <w:r>
+              <w:t>5:52</w:t>
             </w:r>
           </w:p>
         </w:tc>
@@ -379,7 +648,7 @@
       <w:tr>
         <w:tc>
           <w:tcPr>
-            <w:tcW w:type="dxa" w:w="2160"/>
+            <w:tcW w:type="dxa" w:w="1234"/>
           </w:tcPr>
           <w:p>
             <w:r>
@@ -389,7 +658,7 @@
         </w:tc>
         <w:tc>
           <w:tcPr>
-            <w:tcW w:type="dxa" w:w="2160"/>
+            <w:tcW w:type="dxa" w:w="1234"/>
           </w:tcPr>
           <w:p>
             <w:r>
@@ -399,7 +668,17 @@
         </w:tc>
         <w:tc>
           <w:tcPr>
-            <w:tcW w:type="dxa" w:w="2160"/>
+            <w:tcW w:type="dxa" w:w="1234"/>
+          </w:tcPr>
+          <w:p>
+            <w:r>
+              <w:t>110 / 179</w:t>
+            </w:r>
+          </w:p>
+        </w:tc>
+        <w:tc>
+          <w:tcPr>
+            <w:tcW w:type="dxa" w:w="1234"/>
           </w:tcPr>
           <w:p>
             <w:r>
@@ -409,11 +688,31 @@
         </w:tc>
         <w:tc>
           <w:tcPr>
-            <w:tcW w:type="dxa" w:w="2160"/>
+            <w:tcW w:type="dxa" w:w="1234"/>
           </w:tcPr>
           <w:p>
             <w:r>
-              <w:t>5:44</w:t>
+              <w:t>5:45</w:t>
+            </w:r>
+          </w:p>
+        </w:tc>
+        <w:tc>
+          <w:tcPr>
+            <w:tcW w:type="dxa" w:w="1234"/>
+          </w:tcPr>
+          <w:p>
+            <w:r>
+              <w:t>93</w:t>
+            </w:r>
+          </w:p>
+        </w:tc>
+        <w:tc>
+          <w:tcPr>
+            <w:tcW w:type="dxa" w:w="1234"/>
+          </w:tcPr>
+          <w:p>
+            <w:r>
+              <w:t>7:26</w:t>
             </w:r>
           </w:p>
         </w:tc>
@@ -421,7 +720,7 @@
       <w:tr>
         <w:tc>
           <w:tcPr>
-            <w:tcW w:type="dxa" w:w="2160"/>
+            <w:tcW w:type="dxa" w:w="1234"/>
           </w:tcPr>
           <w:p>
             <w:r>
@@ -431,7 +730,7 @@
         </w:tc>
         <w:tc>
           <w:tcPr>
-            <w:tcW w:type="dxa" w:w="2160"/>
+            <w:tcW w:type="dxa" w:w="1234"/>
           </w:tcPr>
           <w:p>
             <w:r>
@@ -441,7 +740,17 @@
         </w:tc>
         <w:tc>
           <w:tcPr>
-            <w:tcW w:type="dxa" w:w="2160"/>
+            <w:tcW w:type="dxa" w:w="1234"/>
+          </w:tcPr>
+          <w:p>
+            <w:r>
+              <w:t>62 / 102</w:t>
+            </w:r>
+          </w:p>
+        </w:tc>
+        <w:tc>
+          <w:tcPr>
+            <w:tcW w:type="dxa" w:w="1234"/>
           </w:tcPr>
           <w:p>
             <w:r>
@@ -451,11 +760,31 @@
         </w:tc>
         <w:tc>
           <w:tcPr>
-            <w:tcW w:type="dxa" w:w="2160"/>
+            <w:tcW w:type="dxa" w:w="1234"/>
           </w:tcPr>
           <w:p>
             <w:r>
-              <w:t>6:16</w:t>
+              <w:t>6:18</w:t>
+            </w:r>
+          </w:p>
+        </w:tc>
+        <w:tc>
+          <w:tcPr>
+            <w:tcW w:type="dxa" w:w="1234"/>
+          </w:tcPr>
+          <w:p>
+            <w:r>
+              <w:t>53</w:t>
+            </w:r>
+          </w:p>
+        </w:tc>
+        <w:tc>
+          <w:tcPr>
+            <w:tcW w:type="dxa" w:w="1234"/>
+          </w:tcPr>
+          <w:p>
+            <w:r>
+              <w:t>8:19</w:t>
             </w:r>
           </w:p>
         </w:tc>
@@ -463,7 +792,7 @@
       <w:tr>
         <w:tc>
           <w:tcPr>
-            <w:tcW w:type="dxa" w:w="2160"/>
+            <w:tcW w:type="dxa" w:w="1234"/>
           </w:tcPr>
           <w:p>
             <w:r>
@@ -473,7 +802,7 @@
         </w:tc>
         <w:tc>
           <w:tcPr>
-            <w:tcW w:type="dxa" w:w="2160"/>
+            <w:tcW w:type="dxa" w:w="1234"/>
           </w:tcPr>
           <w:p>
             <w:r>
@@ -483,7 +812,17 @@
         </w:tc>
         <w:tc>
           <w:tcPr>
-            <w:tcW w:type="dxa" w:w="2160"/>
+            <w:tcW w:type="dxa" w:w="1234"/>
+          </w:tcPr>
+          <w:p>
+            <w:r>
+              <w:t>87 / 129</w:t>
+            </w:r>
+          </w:p>
+        </w:tc>
+        <w:tc>
+          <w:tcPr>
+            <w:tcW w:type="dxa" w:w="1234"/>
           </w:tcPr>
           <w:p>
             <w:r>
@@ -493,11 +832,31 @@
         </w:tc>
         <w:tc>
           <w:tcPr>
-            <w:tcW w:type="dxa" w:w="2160"/>
+            <w:tcW w:type="dxa" w:w="1234"/>
           </w:tcPr>
           <w:p>
             <w:r>
-              <w:t>7:01</w:t>
+              <w:t>7:03</w:t>
+            </w:r>
+          </w:p>
+        </w:tc>
+        <w:tc>
+          <w:tcPr>
+            <w:tcW w:type="dxa" w:w="1234"/>
+          </w:tcPr>
+          <w:p>
+            <w:r>
+              <w:t>67</w:t>
+            </w:r>
+          </w:p>
+        </w:tc>
+        <w:tc>
+          <w:tcPr>
+            <w:tcW w:type="dxa" w:w="1234"/>
+          </w:tcPr>
+          <w:p>
+            <w:r>
+              <w:t>9:26</w:t>
             </w:r>
           </w:p>
         </w:tc>
@@ -524,7 +883,7 @@
         <w:pStyle w:val="ListBullet"/>
       </w:pPr>
       <w:r>
-        <w:t>Provoje me zë të lartë, me kronometër, të paktën pesë herë. Synimi është 8 deri 9 minuta: në sallë flitet më shpejt nga nervozizmi, dhe kryesuesi mund të ta ndërpresë te minuta e dhjetë.</w:t>
+        <w:t>Provoje me zë të lartë, me kronometër, të paktën pesë herë, dhe të dy versionet. Nëse i gjati, me pauzat, të del mbi 9½ minuta, hiqi disa fjali të gjelbra që në provë: në sallë flitet më shpejt nga nervozizmi, por kryesuesi mund të ta ndërpresë te minuta e dhjetë.</w:t>
       </w:r>
     </w:p>
     <w:p>
@@ -1304,7 +1663,7 @@
         <w:pStyle w:val="ListBullet"/>
       </w:pPr>
       <w:r>
-        <w:t>Konfirmo me mentoren ditën, orën, sallën dhe seancën (vitin e kaluar punimet e inxhinierisë softuerike ishin në seancën «Software Engineering»).</w:t>
+        <w:t>Të mërkurën, 21 tetor: shiko agjendën përfundimtare dhe kontrollo radhën, orën dhe sallën.</w:t>
       </w:r>
     </w:p>
     <w:p>
@@ -1312,7 +1671,7 @@
         <w:pStyle w:val="ListBullet"/>
       </w:pPr>
       <w:r>
-        <w:t>Merr prezantimin në USB, si .pptx dhe si PDF, dhe dërgoje edhe me email vetes.</w:t>
+        <w:t>Merr të dy versionet në USB, si .pptx dhe si PDF, dhe dërgoji edhe me email vetes.</w:t>
       </w:r>
     </w:p>
     <w:p>
@@ -1320,7 +1679,7 @@
         <w:pStyle w:val="ListBullet"/>
       </w:pPr>
       <w:r>
-        <w:t>Arrij 30 minuta herët, hape prezantimin në kompjuterin e sallës dhe kontrollo që kodi në sllajdin 8 duket njësoj (shkronja Consolas).</w:t>
+        <w:t>Arrij te salla I-302 rreth 08:30, para se të fillojë seanca. Hape prezantimin në kompjuterin e sallës dhe kontrollo që kodi në sllajdin 8 duket njësoj (shkronja Consolas).</w:t>
       </w:r>
     </w:p>
     <w:p>
@@ -1328,7 +1687,7 @@
         <w:pStyle w:val="ListBullet"/>
       </w:pPr>
       <w:r>
-        <w:t>Prezantohu te kryesuesi i seancës dhe pyet si të sinjalizon kohën.</w:t>
+        <w:t>Prezantohu te kryesuesi i seancës (Blerim Zylifu). Pyete sa minuta ka çdo prezantim dhe si ta sinjalizon kohën. Me 9 minuta ose më shumë merr versionin e gjatë; me më pak, të shkurtrin.</w:t>
       </w:r>
     </w:p>
     <w:p>
@@ -1344,7 +1703,15 @@
         <w:pStyle w:val="ListBullet"/>
       </w:pPr>
       <w:r>
-        <w:t>Nëse në minutën e tetë je ende te sllajdi 6, kalo sllajdin 8 me një fjali dhe mbyll me sllajdin 9.</w:t>
+        <w:t>Me versionin e shkurtër, kur vendi është 7 minuta: nëse në minutën e pestë je ende te sllajdi 6, kalo sllajdin 8 me një fjali dhe mbyll me sllajdin 9.</w:t>
+      </w:r>
+    </w:p>
+    <w:p>
+      <w:pPr>
+        <w:pStyle w:val="ListBullet"/>
+      </w:pPr>
+      <w:r>
+        <w:t>Me versionin e gjatë: nëse në minutën e shtatë je ende te sllajdi 6, lëri të gjitha fjalitë e gjelbra që mbeten dhe vazhdo me tekstin e shkurtër.</w:t>
       </w:r>
     </w:p>
     <w:p>
@@ -1353,6 +1720,11 @@
       </w:pPr>
       <w:r>
         <w:t>Teksti i plotë që thua (shënimet e sllajdeve)</w:t>
+      </w:r>
+    </w:p>
+    <w:p>
+      <w:r>
+        <w:t>Fjalitë me të gjelbër dhe të pjerrëta thuhen vetëm në versionin 9-minutësh. Pa to, mbetet saktësisht teksti i versionit të shkurtër.</w:t>
       </w:r>
     </w:p>
     <w:p>
@@ -1391,7 +1763,17 @@
     </w:p>
     <w:p>
       <w:r>
-        <w:t>To answer them, I built a tool called JavaSmell. It reads Java code and measures 26 metrics for every class and method. On top of these metrics there are three approaches. A uses 8 detection strategies from the literature, such as Lanza and Marinescu and Fowler. B trains machine learning classifiers on the same metrics. And C is a refactoring engine. It rewrites code only when it can prove its preconditions from the syntax tree, and then it checks the result with the Java compiler. On the right you can see the web interface. It also has a plain-language mode for people without a technical background.</w:t>
+        <w:t>To answer them, I built a tool called JavaSmell. It reads Java code and measures 26 metrics for every class and method. On top of these metrics there are three approaches. A uses 8 detection strategies from the literature, such as Lanza and Marinescu and Fowler. B trains machine learning classifiers on the same metrics. And C is a refactoring engine. It rewrites code only when it can prove its preconditions from the syntax tree, and then it checks the result with the Java compiler.</w:t>
+      </w:r>
+      <w:r>
+        <w:rPr>
+          <w:i/>
+          <w:color w:val="2F6F45"/>
+        </w:rPr>
+        <w:t xml:space="preserve"> Every detection also shows the conditions it checked, so a developer can see why a class was flagged, not only that it was.</w:t>
+      </w:r>
+      <w:r>
+        <w:t xml:space="preserve"> On the right you can see the web interface. It also has a plain-language mode for people without a technical background.</w:t>
       </w:r>
     </w:p>
     <w:p>
@@ -1404,7 +1786,17 @@
     </w:p>
     <w:p>
       <w:r>
-        <w:t>For a fair test, we need labels from people. We used MLCQ, a public dataset where professional developers reviewed real open-source Java code. After matching the samples to our tool, we have 9,046 labeled samples from 512 repositories, for four smells. One important detail is how we split the data. Code from the same project looks very similar, so we grouped the data by repository: a model is never tested on a project it learned from. And we report the Matthews correlation coefficient, MCC. Most samples are clean, so simple accuracy would look very good even for a detector that never fires.</w:t>
+        <w:t>For a fair test, we need labels from people. We used MLCQ, a public dataset where professional developers reviewed real open-source Java code. After matching the samples to our tool, we have 9,046 labeled samples from 512 repositories, for four smells.</w:t>
+      </w:r>
+      <w:r>
+        <w:rPr>
+          <w:i/>
+          <w:color w:val="2F6F45"/>
+        </w:rPr>
+        <w:t xml:space="preserve"> Blob is a class that does too much. Data Class only holds data and has almost no behavior. Long Method is a method that has grown too long, and Feature Envy is a method that uses another class more than its own.</w:t>
+      </w:r>
+      <w:r>
+        <w:t xml:space="preserve"> One important detail is how we split the data. Code from the same project looks very similar, so we grouped the data by repository: a model is never tested on a project it learned from. And we report the Matthews correlation coefficient, MCC. Most samples are clean, so simple accuracy would look very good even for a detector that never fires.</w:t>
       </w:r>
     </w:p>
     <w:p>
@@ -1419,6 +1811,13 @@
       <w:r>
         <w:t>Here are the main results. The gray bars are the published rules, and the blue bars are the best machine learning model for each smell. The rules are often correct when they fire, but they catch only 17 to 47 percent of the smells that developers marked. The models are better on all four smells, with MCC from 0.32 to 0.72. We also computed 95 percent confidence intervals by resampling repositories. The improvement is clearly above zero for Blob, Data Class and Long Method. For Feature Envy, the difference could be chance.</w:t>
       </w:r>
+      <w:r>
+        <w:rPr>
+          <w:i/>
+          <w:color w:val="2F6F45"/>
+        </w:rPr>
+        <w:t xml:space="preserve"> We also compared with PMD, a popular open-source analyzer, on the same samples. Once the confidence interval is considered, PMD is never ahead, and for Long Method our rules are clearly better.</w:t>
+      </w:r>
     </w:p>
     <w:p>
       <w:r>
@@ -1430,7 +1829,17 @@
     </w:p>
     <w:p>
       <w:r>
-        <w:t>Why is Feature Envy so hard? We measured how much the human reviewers agree with each other. For Blob, Data Class and Long Method, two reviewers agree only moderately. For Feature Envy, they agree no better than chance. So the problem is not only the algorithm. It is the definition of the smell itself. If experts do not agree on what a smell is, no detector can learn it well. For me, this is the main lesson of the detection part.</w:t>
+        <w:t>Why is Feature Envy so hard? We measured how much the human reviewers agree with each other. For Blob, Data Class and Long Method, two reviewers agree only moderately. For Feature Envy, they agree no better than chance.</w:t>
+      </w:r>
+      <w:r>
+        <w:rPr>
+          <w:i/>
+          <w:color w:val="2F6F45"/>
+        </w:rPr>
+        <w:t xml:space="preserve"> For Feature Envy, their MCC is -0.07, practically zero. This matches the previous slide: Feature Envy is where the model could not clearly beat the rules.</w:t>
+      </w:r>
+      <w:r>
+        <w:t xml:space="preserve"> So the problem is not only the algorithm. It is the definition of the smell itself. If experts do not agree on what a smell is, no detector can learn it well. For me, this is the main lesson of the detection part.</w:t>
       </w:r>
     </w:p>
     <w:p>
@@ -1443,7 +1852,31 @@
     </w:p>
     <w:p>
       <w:r>
-        <w:t>Now the refactoring engine. It supports three transformations: Extract Method, Replace Nested Conditional with Guard Clauses, and Introduce Parameter Object. On the whole corpus it found 15,800 sites and rewrote 3,532 of them, which is 22 percent. The rest were refused, each with a reason. For us, refusing is a correct result, not a failure. After rewriting, the smell disappeared in 65 percent of the cases. Only 1.6 percent of the rewrites introduced a new type of compilation error, and those never reach the code, because the tool only writes verified rewrites. I also read 60 rewrites by hand: after reweighting, about 63 percent would be acceptable to a developer.</w:t>
+        <w:t>Now the refactoring engine. It supports three transformations: Extract Method, Replace Nested Conditional with Guard Clauses, and Introduce Parameter Object. On the whole corpus it found 15,800 sites and rewrote 3,532 of them, which is 22 percent. The rest were refused, each with a reason.</w:t>
+      </w:r>
+      <w:r>
+        <w:rPr>
+          <w:i/>
+          <w:color w:val="2F6F45"/>
+        </w:rPr>
+        <w:t xml:space="preserve"> In 45 percent of the sites, the reason is simply that the code does not have the shape the transformation needs.</w:t>
+      </w:r>
+      <w:r>
+        <w:t xml:space="preserve"> For us, refusing is a correct result, not a failure. After rewriting, the smell disappeared in 65 percent of the cases. Only 1.6 percent of the rewrites introduced a new type of compilation error, and those never reach the code, because the tool only writes verified rewrites. I also read 60 rewrites by hand: after reweighting, about 63 percent would be acceptable to a developer.</w:t>
+      </w:r>
+      <w:r>
+        <w:rPr>
+          <w:i/>
+          <w:color w:val="2F6F45"/>
+        </w:rPr>
+        <w:t xml:space="preserve"> Refactoring can also create new smells: 865 appeared after rewriting, most often Long Parameter List, because Extract Method passes every input as a parameter.</w:t>
+      </w:r>
+      <w:r>
+        <w:rPr>
+          <w:i/>
+          <w:color w:val="2F6F45"/>
+        </w:rPr>
+        <w:t xml:space="preserve"> In that review, Guard Clauses were always acceptable, and Introduce Parameter Object never, because it only moves the long list into a new class.</w:t>
       </w:r>
     </w:p>
     <w:p>
@@ -1456,7 +1889,17 @@
     </w:p>
     <w:p>
       <w:r>
-        <w:t>Here is one real example from Apache Geode. Before, the whole method is wrapped in one if statement, so everything is nested deeply. After the rewrite, the condition becomes a guard clause with an early return, and the rest of the method moves one level up. The rewrite passed the compiler check, and in my review it was acceptable as it is.</w:t>
+        <w:t>Here is one real example from Apache Geode. Before, the whole method is wrapped in one if statement, so everything is nested deeply. After the rewrite, the condition becomes a guard clause with an early return, and the rest of the method moves one level up.</w:t>
+      </w:r>
+      <w:r>
+        <w:rPr>
+          <w:i/>
+          <w:color w:val="2F6F45"/>
+        </w:rPr>
+        <w:t xml:space="preserve"> The engine accepts only exactly this shape: a void method whose whole body is one if statement, without else. It also wraps the condition in a not, instead of inverting it by hand, so it stays correct for every condition.</w:t>
+      </w:r>
+      <w:r>
+        <w:t xml:space="preserve"> The rewrite passed the compiler check, and in my review it was acceptable as it is.</w:t>
       </w:r>
     </w:p>
     <w:p>
@@ -1469,7 +1912,24 @@
     </w:p>
     <w:p>
       <w:r>
-        <w:t>To be honest about the limits: compiling is not the same as behaving the same. We did not run the projects' test suites, so behavior preservation is future work. We also used one dataset, four smells, and only Java. To summarize: learned boundaries beat fixed thresholds. Safe automatic refactoring is possible, but narrow, and it should be reviewed by a developer. The tool is open source, and every number in this talk can be regenerated with a script. Thank you. I am happy to take your questions.</w:t>
+        <w:t>To be honest about the limits: compiling is not the same as behaving the same. We did not run the projects' test suites, so behavior preservation is future work. We also used one dataset, four smells, and only Java.</w:t>
+      </w:r>
+      <w:r>
+        <w:rPr>
+          <w:i/>
+          <w:color w:val="2F6F45"/>
+        </w:rPr>
+        <w:t xml:space="preserve"> And the best model was chosen on the same predictions it is scored on, so its numbers are slightly optimistic.</w:t>
+      </w:r>
+      <w:r>
+        <w:rPr>
+          <w:i/>
+          <w:color w:val="2F6F45"/>
+        </w:rPr>
+        <w:t xml:space="preserve"> As next steps, I would add a small symbol resolver to support more refactorings, and ask independent reviewers to judge the rewrites.</w:t>
+      </w:r>
+      <w:r>
+        <w:t xml:space="preserve"> To summarize: learned boundaries beat fixed thresholds. Safe automatic refactoring is possible, but narrow, and it should be reviewed by a developer. The tool is open source, and every number in this talk can be regenerated with a script. Thank you. I am happy to take your questions.</w:t>
       </w:r>
     </w:p>
     <w:sectPr>

</xml_diff>

<commit_message>
Thjeshto tekstin folës dhe shto librin e punimit
Tekst me fjali të shkurtra, 40 pyetje në katër nivele, dhe Punimi_nga_e_para.docx në vend të dokumentit të njohurive.
</commit_message>
<xml_diff>
--- a/docs/konferenca/UBT2026_pergatitja.docx
+++ b/docs/konferenca/UBT2026_pergatitja.docx
@@ -86,7 +86,7 @@
         <w:pStyle w:val="ListBullet"/>
       </w:pPr>
       <w:r>
-        <w:t>UBT2026_Florent_Latifi.pptx: versioni i shkurtër, 878 fjalë, rreth 7:38 me ritëm të qetë. Për rastin kur kryesuesi jep 7 minuta ose më pak.</w:t>
+        <w:t>UBT2026_Florent_Latifi.pptx: versioni i shkurtër, 849 fjalë, rreth 7:23 me ritëm të qetë. Për rastin kur kryesuesi jep 7 minuta ose më pak.</w:t>
       </w:r>
     </w:p>
     <w:p>
@@ -94,7 +94,7 @@
         <w:pStyle w:val="ListBullet"/>
       </w:pPr>
       <w:r>
-        <w:t>UBT2026_Florent_Latifi_9min.pptx: versioni i gjatë, 1110 fjalë, rreth 9:39 me ritëm të qetë. Për rastin kur jep vërtet 10 minuta, siç thotë email-i.</w:t>
+        <w:t>UBT2026_Florent_Latifi_9min.pptx: versioni i gjatë, 1072 fjalë, rreth 9:19 me ritëm të qetë. Për rastin kur jep vërtet 10 minuta, siç thotë email-i.</w:t>
       </w:r>
     </w:p>
     <w:p>
@@ -110,7 +110,7 @@
         <w:pStyle w:val="ListBullet"/>
       </w:pPr>
       <w:r>
-        <w:t>Me ritëm të shpejtë (145 fjalë në minutë) i shkurtri zgjat 6:03 dhe i gjati 7:39, pa pauzat. Ky ritëm është supozim. Për ta matur tëndin, lexo me zë tekstin e sllajdit 2 me kronometër: fjalët e tij (te tabela) pjesëtuar me minutat janë ritmi yt.</w:t>
+        <w:t>Me ritëm të shpejtë (145 fjalë në minutë) i shkurtri zgjat 5:51 dhe i gjati 7:24, pa pauzat. Ky ritëm është supozim. Për ta matur tëndin, lexo me zë tekstin e sllajdit 2 me kronometër: fjalët e tij (te tabela) pjesëtuar me minutat janë ritmi yt.</w:t>
       </w:r>
     </w:p>
     <w:p>
@@ -240,7 +240,7 @@
           </w:tcPr>
           <w:p>
             <w:r>
-              <w:t>54</w:t>
+              <w:t>50</w:t>
             </w:r>
           </w:p>
         </w:tc>
@@ -250,7 +250,7 @@
           </w:tcPr>
           <w:p>
             <w:r>
-              <w:t>28</w:t>
+              <w:t>26</w:t>
             </w:r>
           </w:p>
         </w:tc>
@@ -260,7 +260,7 @@
           </w:tcPr>
           <w:p>
             <w:r>
-              <w:t>0:28</w:t>
+              <w:t>0:26</w:t>
             </w:r>
           </w:p>
         </w:tc>
@@ -270,7 +270,7 @@
           </w:tcPr>
           <w:p>
             <w:r>
-              <w:t>28</w:t>
+              <w:t>26</w:t>
             </w:r>
           </w:p>
         </w:tc>
@@ -280,7 +280,7 @@
           </w:tcPr>
           <w:p>
             <w:r>
-              <w:t>0:28</w:t>
+              <w:t>0:26</w:t>
             </w:r>
           </w:p>
         </w:tc>
@@ -312,7 +312,7 @@
           </w:tcPr>
           <w:p>
             <w:r>
-              <w:t>117</w:t>
+              <w:t>100</w:t>
             </w:r>
           </w:p>
         </w:tc>
@@ -322,7 +322,7 @@
           </w:tcPr>
           <w:p>
             <w:r>
-              <w:t>61</w:t>
+              <w:t>52</w:t>
             </w:r>
           </w:p>
         </w:tc>
@@ -332,7 +332,7 @@
           </w:tcPr>
           <w:p>
             <w:r>
-              <w:t>1:29</w:t>
+              <w:t>1:18</w:t>
             </w:r>
           </w:p>
         </w:tc>
@@ -342,7 +342,7 @@
           </w:tcPr>
           <w:p>
             <w:r>
-              <w:t>61</w:t>
+              <w:t>52</w:t>
             </w:r>
           </w:p>
         </w:tc>
@@ -352,7 +352,7 @@
           </w:tcPr>
           <w:p>
             <w:r>
-              <w:t>1:29</w:t>
+              <w:t>1:18</w:t>
             </w:r>
           </w:p>
         </w:tc>
@@ -384,7 +384,7 @@
           </w:tcPr>
           <w:p>
             <w:r>
-              <w:t>49</w:t>
+              <w:t>56 / 79</w:t>
             </w:r>
           </w:p>
         </w:tc>
@@ -394,7 +394,7 @@
           </w:tcPr>
           <w:p>
             <w:r>
-              <w:t>26</w:t>
+              <w:t>29</w:t>
             </w:r>
           </w:p>
         </w:tc>
@@ -404,7 +404,7 @@
           </w:tcPr>
           <w:p>
             <w:r>
-              <w:t>1:55</w:t>
+              <w:t>1:47</w:t>
             </w:r>
           </w:p>
         </w:tc>
@@ -414,7 +414,7 @@
           </w:tcPr>
           <w:p>
             <w:r>
-              <w:t>26</w:t>
+              <w:t>41</w:t>
             </w:r>
           </w:p>
         </w:tc>
@@ -424,7 +424,7 @@
           </w:tcPr>
           <w:p>
             <w:r>
-              <w:t>1:55</w:t>
+              <w:t>1:59</w:t>
             </w:r>
           </w:p>
         </w:tc>
@@ -456,7 +456,7 @@
           </w:tcPr>
           <w:p>
             <w:r>
-              <w:t>107 / 130</w:t>
+              <w:t>94 / 111</w:t>
             </w:r>
           </w:p>
         </w:tc>
@@ -466,7 +466,7 @@
           </w:tcPr>
           <w:p>
             <w:r>
-              <w:t>56</w:t>
+              <w:t>49</w:t>
             </w:r>
           </w:p>
         </w:tc>
@@ -476,7 +476,7 @@
           </w:tcPr>
           <w:p>
             <w:r>
-              <w:t>2:51</w:t>
+              <w:t>2:37</w:t>
             </w:r>
           </w:p>
         </w:tc>
@@ -486,7 +486,7 @@
           </w:tcPr>
           <w:p>
             <w:r>
-              <w:t>68</w:t>
+              <w:t>58</w:t>
             </w:r>
           </w:p>
         </w:tc>
@@ -496,7 +496,7 @@
           </w:tcPr>
           <w:p>
             <w:r>
-              <w:t>3:03</w:t>
+              <w:t>2:57</w:t>
             </w:r>
           </w:p>
         </w:tc>
@@ -528,7 +528,7 @@
           </w:tcPr>
           <w:p>
             <w:r>
-              <w:t>102</w:t>
+              <w:t>92 / 119</w:t>
             </w:r>
           </w:p>
         </w:tc>
@@ -538,7 +538,7 @@
           </w:tcPr>
           <w:p>
             <w:r>
-              <w:t>53</w:t>
+              <w:t>48</w:t>
             </w:r>
           </w:p>
         </w:tc>
@@ -548,7 +548,7 @@
           </w:tcPr>
           <w:p>
             <w:r>
-              <w:t>3:44</w:t>
+              <w:t>3:25</w:t>
             </w:r>
           </w:p>
         </w:tc>
@@ -558,7 +558,7 @@
           </w:tcPr>
           <w:p>
             <w:r>
-              <w:t>53</w:t>
+              <w:t>62</w:t>
             </w:r>
           </w:p>
         </w:tc>
@@ -568,7 +568,7 @@
           </w:tcPr>
           <w:p>
             <w:r>
-              <w:t>3:56</w:t>
+              <w:t>3:59</w:t>
             </w:r>
           </w:p>
         </w:tc>
@@ -600,7 +600,7 @@
           </w:tcPr>
           <w:p>
             <w:r>
-              <w:t>109 / 141</w:t>
+              <w:t>88 / 119</w:t>
             </w:r>
           </w:p>
         </w:tc>
@@ -610,7 +610,7 @@
           </w:tcPr>
           <w:p>
             <w:r>
-              <w:t>57</w:t>
+              <w:t>46</w:t>
             </w:r>
           </w:p>
         </w:tc>
@@ -620,7 +620,7 @@
           </w:tcPr>
           <w:p>
             <w:r>
-              <w:t>4:41</w:t>
+              <w:t>4:10</w:t>
             </w:r>
           </w:p>
         </w:tc>
@@ -630,7 +630,7 @@
           </w:tcPr>
           <w:p>
             <w:r>
-              <w:t>74</w:t>
+              <w:t>62</w:t>
             </w:r>
           </w:p>
         </w:tc>
@@ -640,7 +640,7 @@
           </w:tcPr>
           <w:p>
             <w:r>
-              <w:t>5:09</w:t>
+              <w:t>5:02</w:t>
             </w:r>
           </w:p>
         </w:tc>
@@ -672,7 +672,7 @@
           </w:tcPr>
           <w:p>
             <w:r>
-              <w:t>81 / 107</w:t>
+              <w:t>78 / 84</w:t>
             </w:r>
           </w:p>
         </w:tc>
@@ -682,7 +682,7 @@
           </w:tcPr>
           <w:p>
             <w:r>
-              <w:t>42</w:t>
+              <w:t>41</w:t>
             </w:r>
           </w:p>
         </w:tc>
@@ -692,7 +692,7 @@
           </w:tcPr>
           <w:p>
             <w:r>
-              <w:t>5:23</w:t>
+              <w:t>4:51</w:t>
             </w:r>
           </w:p>
         </w:tc>
@@ -702,7 +702,7 @@
           </w:tcPr>
           <w:p>
             <w:r>
-              <w:t>56</w:t>
+              <w:t>44</w:t>
             </w:r>
           </w:p>
         </w:tc>
@@ -712,7 +712,7 @@
           </w:tcPr>
           <w:p>
             <w:r>
-              <w:t>6:05</w:t>
+              <w:t>5:45</w:t>
             </w:r>
           </w:p>
         </w:tc>
@@ -744,7 +744,7 @@
           </w:tcPr>
           <w:p>
             <w:r>
-              <w:t>110 / 179</w:t>
+              <w:t>132 / 179</w:t>
             </w:r>
           </w:p>
         </w:tc>
@@ -754,7 +754,7 @@
           </w:tcPr>
           <w:p>
             <w:r>
-              <w:t>57</w:t>
+              <w:t>69</w:t>
             </w:r>
           </w:p>
         </w:tc>
@@ -764,7 +764,7 @@
           </w:tcPr>
           <w:p>
             <w:r>
-              <w:t>6:20</w:t>
+              <w:t>6:00</w:t>
             </w:r>
           </w:p>
         </w:tc>
@@ -784,7 +784,7 @@
           </w:tcPr>
           <w:p>
             <w:r>
-              <w:t>7:39</w:t>
+              <w:t>7:19</w:t>
             </w:r>
           </w:p>
         </w:tc>
@@ -816,7 +816,7 @@
           </w:tcPr>
           <w:p>
             <w:r>
-              <w:t>62 / 102</w:t>
+              <w:t>58 / 92</w:t>
             </w:r>
           </w:p>
         </w:tc>
@@ -826,7 +826,7 @@
           </w:tcPr>
           <w:p>
             <w:r>
-              <w:t>32</w:t>
+              <w:t>30</w:t>
             </w:r>
           </w:p>
         </w:tc>
@@ -836,7 +836,7 @@
           </w:tcPr>
           <w:p>
             <w:r>
-              <w:t>6:53</w:t>
+              <w:t>6:30</w:t>
             </w:r>
           </w:p>
         </w:tc>
@@ -846,7 +846,7 @@
           </w:tcPr>
           <w:p>
             <w:r>
-              <w:t>53</w:t>
+              <w:t>48</w:t>
             </w:r>
           </w:p>
         </w:tc>
@@ -856,7 +856,7 @@
           </w:tcPr>
           <w:p>
             <w:r>
-              <w:t>8:32</w:t>
+              <w:t>8:07</w:t>
             </w:r>
           </w:p>
         </w:tc>
@@ -888,7 +888,7 @@
           </w:tcPr>
           <w:p>
             <w:r>
-              <w:t>87 / 129</w:t>
+              <w:t>101 / 139</w:t>
             </w:r>
           </w:p>
         </w:tc>
@@ -898,7 +898,7 @@
           </w:tcPr>
           <w:p>
             <w:r>
-              <w:t>45</w:t>
+              <w:t>53</w:t>
             </w:r>
           </w:p>
         </w:tc>
@@ -908,7 +908,7 @@
           </w:tcPr>
           <w:p>
             <w:r>
-              <w:t>7:38</w:t>
+              <w:t>7:23</w:t>
             </w:r>
           </w:p>
         </w:tc>
@@ -918,7 +918,7 @@
           </w:tcPr>
           <w:p>
             <w:r>
-              <w:t>67</w:t>
+              <w:t>73</w:t>
             </w:r>
           </w:p>
         </w:tc>
@@ -928,7 +928,7 @@
           </w:tcPr>
           <w:p>
             <w:r>
-              <w:t>9:39</w:t>
+              <w:t>9:19</w:t>
             </w:r>
           </w:p>
         </w:tc>
@@ -1040,18 +1040,357 @@
     </w:p>
     <w:p>
       <w:r>
+        <w:t>Lista e plotë, me përgjigjen shqip dhe sllajdin rezervë për secilën, është te UBT2026_cka_te_flas.docx.</w:t>
+      </w:r>
+    </w:p>
+    <w:p>
+      <w:pPr>
+        <w:pStyle w:val="Heading2"/>
+      </w:pPr>
+      <w:r>
+        <w:t>Niveli 1: Dikush që e dëgjon temën për herë të parë</w:t>
+      </w:r>
+    </w:p>
+    <w:p>
+      <w:pPr>
+        <w:spacing w:after="0"/>
+      </w:pPr>
+      <w:r>
         <w:rPr>
           <w:b/>
         </w:rPr>
-        <w:t>Why MCC and not accuracy or F1?</w:t>
+        <w:t>What is a code smell?</w:t>
       </w:r>
     </w:p>
     <w:p>
       <w:r>
-        <w:t>Most samples are clean, so a detector that never fires already has high accuracy. MCC uses all four cells of the confusion matrix and is zero for a detector that learns nothing. We also report precision, recall and F1 for completeness.</w:t>
+        <w:t>A sign that code is badly organized: it works, but it is hard to change. Like a smell in the fridge, it does not prove something is rotten, but it tells you to look.</w:t>
       </w:r>
     </w:p>
     <w:p>
+      <w:pPr>
+        <w:spacing w:after="0"/>
+      </w:pPr>
+      <w:r>
+        <w:rPr>
+          <w:b/>
+        </w:rPr>
+        <w:t>If the program works, why does it matter?</w:t>
+      </w:r>
+    </w:p>
+    <w:p>
+      <w:r>
+        <w:t>Because most of the cost of software comes after it is written: fixing it, changing it, adding features. Smelly code makes every change slower and riskier.</w:t>
+      </w:r>
+    </w:p>
+    <w:p>
+      <w:pPr>
+        <w:spacing w:after="0"/>
+      </w:pPr>
+      <w:r>
+        <w:rPr>
+          <w:b/>
+        </w:rPr>
+        <w:t>So is it like a spell checker for code?</w:t>
+      </w:r>
+    </w:p>
+    <w:p>
+      <w:r>
+        <w:t>A little, yes. It points at the places that are hard to maintain, explains why, and for some of them it prepares a fix.</w:t>
+      </w:r>
+    </w:p>
+    <w:p>
+      <w:pPr>
+        <w:spacing w:after="0"/>
+      </w:pPr>
+      <w:r>
+        <w:rPr>
+          <w:b/>
+        </w:rPr>
+        <w:t>Did you use ChatGPT or another AI to fix the code?</w:t>
+      </w:r>
+    </w:p>
+    <w:p>
+      <w:r>
+        <w:t>No. The fixes are fixed program transformations, not generated text. An AI model can write code that looks right, but it cannot prove that the change is safe, and it can give a different answer each time.</w:t>
+      </w:r>
+    </w:p>
+    <w:p>
+      <w:pPr>
+        <w:spacing w:after="0"/>
+      </w:pPr>
+      <w:r>
+        <w:rPr>
+          <w:b/>
+        </w:rPr>
+        <w:t>Who decided which code is smelly?</w:t>
+      </w:r>
+    </w:p>
+    <w:p>
+      <w:r>
+        <w:t>Twenty-six professional developers, in a public dataset called MLCQ. I did not label the data myself, so my own opinion does not shape the results.</w:t>
+      </w:r>
+    </w:p>
+    <w:p>
+      <w:pPr>
+        <w:spacing w:after="0"/>
+      </w:pPr>
+      <w:r>
+        <w:rPr>
+          <w:b/>
+        </w:rPr>
+        <w:t>What does machine learning mean here, in simple words?</w:t>
+      </w:r>
+    </w:p>
+    <w:p>
+      <w:r>
+        <w:t>Instead of fixed rules, the computer learns from thousands of examples that developers judged, and finds by itself the line between smelly and clean code.</w:t>
+      </w:r>
+    </w:p>
+    <w:p>
+      <w:pPr>
+        <w:spacing w:after="0"/>
+      </w:pPr>
+      <w:r>
+        <w:rPr>
+          <w:b/>
+        </w:rPr>
+        <w:t>Does it change my code without asking me?</w:t>
+      </w:r>
+    </w:p>
+    <w:p>
+      <w:r>
+        <w:t>No. It first shows the change, and it writes it as a separate patch file. Changing the files directly needs an explicit option.</w:t>
+      </w:r>
+    </w:p>
+    <w:p>
+      <w:pPr>
+        <w:spacing w:after="0"/>
+      </w:pPr>
+      <w:r>
+        <w:rPr>
+          <w:b/>
+        </w:rPr>
+        <w:t>Does it work for Python or other languages?</w:t>
+      </w:r>
+    </w:p>
+    <w:p>
+      <w:r>
+        <w:t>Not yet. The parser I use supports many languages, but the measurements and the fixes are written for Java.</w:t>
+      </w:r>
+    </w:p>
+    <w:p>
+      <w:pPr>
+        <w:spacing w:after="0"/>
+      </w:pPr>
+      <w:r>
+        <w:rPr>
+          <w:b/>
+        </w:rPr>
+        <w:t>Can I use it? Does it cost anything?</w:t>
+      </w:r>
+    </w:p>
+    <w:p>
+      <w:r>
+        <w:t>Yes, and it is free. It is open source on GitHub under the MIT license, and it runs on a normal laptop.</w:t>
+      </w:r>
+    </w:p>
+    <w:p>
+      <w:pPr>
+        <w:spacing w:after="0"/>
+      </w:pPr>
+      <w:r>
+        <w:rPr>
+          <w:b/>
+        </w:rPr>
+        <w:t>What surprised you the most?</w:t>
+      </w:r>
+    </w:p>
+    <w:p>
+      <w:r>
+        <w:t>That for Feature Envy even two experts agree no better than chance. So part of the difficulty is in the definition of the smell, not only in the tools.</w:t>
+      </w:r>
+    </w:p>
+    <w:p>
+      <w:pPr>
+        <w:pStyle w:val="Heading2"/>
+      </w:pPr>
+      <w:r>
+        <w:t>Niveli 2: Student i informatikës</w:t>
+      </w:r>
+    </w:p>
+    <w:p>
+      <w:pPr>
+        <w:spacing w:after="0"/>
+      </w:pPr>
+      <w:r>
+        <w:rPr>
+          <w:b/>
+        </w:rPr>
+        <w:t>What is MCC, and why not accuracy?</w:t>
+      </w:r>
+    </w:p>
+    <w:p>
+      <w:r>
+        <w:t>MCC is a score from minus one to one: zero means guessing, one means perfect. Most code is clean, so on Feature Envy a detector that always says “clean” is 93% accurate, but its MCC is zero.</w:t>
+      </w:r>
+    </w:p>
+    <w:p>
+      <w:pPr>
+        <w:spacing w:after="0"/>
+      </w:pPr>
+      <w:r>
+        <w:rPr>
+          <w:b/>
+        </w:rPr>
+        <w:t>What are the 26 metrics?</w:t>
+      </w:r>
+    </w:p>
+    <w:p>
+      <w:r>
+        <w:t>Simple numbers about the code: 17 for classes and 9 for methods. For example lines of code, number of methods, how many paths the code has, how deep the blocks are nested, and how much a method uses data from other classes.</w:t>
+      </w:r>
+    </w:p>
+    <w:p>
+      <w:pPr>
+        <w:spacing w:after="0"/>
+      </w:pPr>
+      <w:r>
+        <w:rPr>
+          <w:b/>
+        </w:rPr>
+        <w:t>Which rules did you use?</w:t>
+      </w:r>
+    </w:p>
+    <w:p>
+      <w:r>
+        <w:t>8 detection strategies, mostly from Lanza and Marinescu's book Object-Oriented Metrics in Practice, and from Fowler for Long Method and Long Parameter List.</w:t>
+      </w:r>
+    </w:p>
+    <w:p>
+      <w:pPr>
+        <w:spacing w:after="0"/>
+      </w:pPr>
+      <w:r>
+        <w:rPr>
+          <w:b/>
+        </w:rPr>
+        <w:t>Which machine learning model was the best?</w:t>
+      </w:r>
+    </w:p>
+    <w:p>
+      <w:r>
+        <w:t>It depends on the smell: logistic regression for Blob; gradient boosting for Data Class and Feature Envy; random forest for Long Method. The backup slide shows all of them.</w:t>
+      </w:r>
+    </w:p>
+    <w:p>
+      <w:pPr>
+        <w:spacing w:after="0"/>
+      </w:pPr>
+      <w:r>
+        <w:rPr>
+          <w:b/>
+        </w:rPr>
+        <w:t>What are precision and recall?</w:t>
+      </w:r>
+    </w:p>
+    <w:p>
+      <w:r>
+        <w:t>Precision: when the tool says “smell”, how often it is right. Recall: of all the real smells, how many it finds. The rules have high precision but low recall.</w:t>
+      </w:r>
+    </w:p>
+    <w:p>
+      <w:pPr>
+        <w:spacing w:after="0"/>
+      </w:pPr>
+      <w:r>
+        <w:rPr>
+          <w:b/>
+        </w:rPr>
+        <w:t>Why do the models give more false alarms?</w:t>
+      </w:r>
+    </w:p>
+    <w:p>
+      <w:r>
+        <w:t>Because they find many more real smells, and the price is more alarms that turn out wrong. On 3 of the 4 smells their precision is lower than the rules'.</w:t>
+      </w:r>
+    </w:p>
+    <w:p>
+      <w:pPr>
+        <w:spacing w:after="0"/>
+      </w:pPr>
+      <w:r>
+        <w:rPr>
+          <w:b/>
+        </w:rPr>
+        <w:t>Why were only 22% of the places changed?</w:t>
+      </w:r>
+    </w:p>
+    <w:p>
+      <w:r>
+        <w:t>Because the engine refuses whenever it cannot prove the change is safe. The main reasons: the code does not have the right shape (45%), or a return or break would leave the moved block (26%).</w:t>
+      </w:r>
+    </w:p>
+    <w:p>
+      <w:pPr>
+        <w:spacing w:after="0"/>
+      </w:pPr>
+      <w:r>
+        <w:rPr>
+          <w:b/>
+        </w:rPr>
+        <w:t>What does “compiles” mean, if the projects cannot be built?</w:t>
+      </w:r>
+    </w:p>
+    <w:p>
+      <w:r>
+        <w:t>The projects come without their build files, so many files do not compile alone even before the change. So I compile before and after, and a change counts only if it adds no new kind of error.</w:t>
+      </w:r>
+    </w:p>
+    <w:p>
+      <w:pPr>
+        <w:spacing w:after="0"/>
+      </w:pPr>
+      <w:r>
+        <w:rPr>
+          <w:b/>
+        </w:rPr>
+        <w:t>Which three fixes, exactly?</w:t>
+      </w:r>
+    </w:p>
+    <w:p>
+      <w:r>
+        <w:t>Extract Method moves part of a long method into a new method. Guard Clauses turns a big if around the whole method into an early return. Introduce Parameter Object groups many parameters into one object.</w:t>
+      </w:r>
+    </w:p>
+    <w:p>
+      <w:pPr>
+        <w:spacing w:after="0"/>
+      </w:pPr>
+      <w:r>
+        <w:rPr>
+          <w:b/>
+        </w:rPr>
+        <w:t>What is MLCQ?</w:t>
+      </w:r>
+    </w:p>
+    <w:p>
+      <w:r>
+        <w:t>A public dataset by Madeyski and Lewowski, 2020: about fifteen thousand reviews of real open-source Java code by twenty-six professional developers, for four smells.</w:t>
+      </w:r>
+    </w:p>
+    <w:p>
+      <w:pPr>
+        <w:pStyle w:val="Heading2"/>
+      </w:pPr>
+      <w:r>
+        <w:t>Niveli 3: Pedagog</w:t>
+      </w:r>
+    </w:p>
+    <w:p>
+      <w:pPr>
+        <w:spacing w:after="0"/>
+      </w:pPr>
       <w:r>
         <w:rPr>
           <w:b/>
@@ -1061,114 +1400,61 @@
     </w:p>
     <w:p>
       <w:r>
-        <w:t>We split by repository with grouped cross-validation, five folds. Code from one project never appears in both training and testing, because similar code from the same project would inflate the results.</w:t>
+        <w:t>I grouped the data by project, with 5-fold grouped cross-validation. A project is never in training and testing at the same time, because code from one project is very similar.</w:t>
+      </w:r>
+    </w:p>
+    <w:p>
+      <w:pPr>
+        <w:spacing w:after="0"/>
+      </w:pPr>
+      <w:r>
+        <w:rPr>
+          <w:b/>
+        </w:rPr>
+        <w:t>How do you know the improvement is not luck?</w:t>
       </w:r>
     </w:p>
     <w:p>
       <w:r>
+        <w:t>I resampled whole projects 2,000 times and recomputed the difference each time. For Blob, Data Class and Long Method the 95 percent interval stays above zero; for Feature Envy it includes zero, so I do not claim it.</w:t>
+      </w:r>
+    </w:p>
+    <w:p>
+      <w:pPr>
+        <w:spacing w:after="0"/>
+      </w:pPr>
+      <w:r>
         <w:rPr>
           <w:b/>
         </w:rPr>
-        <w:t>Why is Feature Envy so poor?</w:t>
+        <w:t>Why not deep learning?</w:t>
       </w:r>
     </w:p>
     <w:p>
       <w:r>
-        <w:t>Even two human reviewers do not agree on it: their MCC is -0.07, which is chance level. A label that humans do not agree on cannot be learned well.</w:t>
+        <w:t>The data is small and it is a table of numbers, the models must be explainable, and everything had to run on a laptop at zero cost. Simple models were already enough to beat the rules.</w:t>
+      </w:r>
+    </w:p>
+    <w:p>
+      <w:pPr>
+        <w:spacing w:after="0"/>
+      </w:pPr>
+      <w:r>
+        <w:rPr>
+          <w:b/>
+        </w:rPr>
+        <w:t>How does it compare with tools like PMD or SonarQube?</w:t>
       </w:r>
     </w:p>
     <w:p>
       <w:r>
-        <w:rPr>
-          <w:b/>
-        </w:rPr>
-        <w:t>Which model was best, and why not deep learning?</w:t>
+        <w:t>I compared with PMD on the same samples: once the confidence interval is considered it is never ahead, and for Long Method my rules are clearly better. I did not compare with SonarQube; that is a good next step.</w:t>
       </w:r>
     </w:p>
     <w:p>
-      <w:r>
-        <w:t>Logistic regression for Blob, gradient boosting for Data Class and Feature Envy, random forest for Long Method. The data is tabular and small, the models must be explainable, and everything had to run on a laptop at zero cost.</w:t>
-      </w:r>
-    </w:p>
-    <w:p>
-      <w:r>
-        <w:rPr>
-          <w:b/>
-        </w:rPr>
-        <w:t>Isn't choosing the best model optimistic?</w:t>
-      </w:r>
-    </w:p>
-    <w:p>
-      <w:r>
-        <w:t>Yes, slightly, because the choice is made on the same predictions. That is why we report every algorithm: even the weakest one beats the rules on 3 of 4 smells, so the conclusion does not depend on the choice.</w:t>
-      </w:r>
-    </w:p>
-    <w:p>
-      <w:r>
-        <w:rPr>
-          <w:b/>
-        </w:rPr>
-        <w:t>How do you know the refactoring does not change behavior?</w:t>
-      </w:r>
-    </w:p>
-    <w:p>
-      <w:r>
-        <w:t>We do not claim that. We prove preconditions on the syntax tree and check with the compiler. Running the projects' tests was not possible, because the corpus has no build files. It is the main future work.</w:t>
-      </w:r>
-    </w:p>
-    <w:p>
-      <w:r>
-        <w:rPr>
-          <w:b/>
-        </w:rPr>
-        <w:t>Why only 22% of the sites?</w:t>
-      </w:r>
-    </w:p>
-    <w:p>
-      <w:r>
-        <w:t>The engine refuses when it cannot prove a precondition. The main reasons are that the code shape does not match (45%) or that a return or break leaves the block (26%). A refusal is a correct result, not a failure.</w:t>
-      </w:r>
-    </w:p>
-    <w:p>
-      <w:r>
-        <w:rPr>
-          <w:b/>
-        </w:rPr>
-        <w:t>What happens to the rewrites with new errors?</w:t>
-      </w:r>
-    </w:p>
-    <w:p>
-      <w:r>
-        <w:t>They are counted in the evaluation, but the tool never writes them: only rewrites that pass verification go into the patch.</w:t>
-      </w:r>
-    </w:p>
-    <w:p>
-      <w:r>
-        <w:rPr>
-          <w:b/>
-        </w:rPr>
-        <w:t>Why not use a large language model to refactor?</w:t>
-      </w:r>
-    </w:p>
-    <w:p>
-      <w:r>
-        <w:t>We wanted deterministic, verifiable and free rewrites. A language model can produce plausible code, but it cannot prove the preconditions, and the results would not be reproducible.</w:t>
-      </w:r>
-    </w:p>
-    <w:p>
-      <w:r>
-        <w:rPr>
-          <w:b/>
-        </w:rPr>
-        <w:t>How does it compare to existing tools?</w:t>
-      </w:r>
-    </w:p>
-    <w:p>
-      <w:r>
-        <w:t>We compared with PMD on the same samples. PMD was never ahead once the confidence interval is considered, and ours was clearly better for Long Method. We did not compare with commercial tools such as SonarQube.</w:t>
-      </w:r>
-    </w:p>
-    <w:p>
+      <w:pPr>
+        <w:spacing w:after="0"/>
+      </w:pPr>
       <w:r>
         <w:rPr>
           <w:b/>
@@ -1178,85 +1464,255 @@
     </w:p>
     <w:p>
       <w:r>
-        <w:t>Mostly from Lanza and Marinescu. Four values have no published source, for example 30 lines for Long Method, and we measured how sensitive the results are to them.</w:t>
+        <w:t>Mostly from Lanza and Marinescu. Four values have no published source, for example 30 lines for Long Method. I say so in the thesis, and I tested how sensitive the results are to that one.</w:t>
+      </w:r>
+    </w:p>
+    <w:p>
+      <w:pPr>
+        <w:spacing w:after="0"/>
+      </w:pPr>
+      <w:r>
+        <w:rPr>
+          <w:b/>
+        </w:rPr>
+        <w:t>How does the tool decide how serious a smell is?</w:t>
       </w:r>
     </w:p>
     <w:p>
       <w:r>
+        <w:t>It measures how far each value is past its limit, as a ratio, and takes the average. Below 1.5 it is minor, below 2.5 major, above that critical: the same scale as MLCQ.</w:t>
+      </w:r>
+    </w:p>
+    <w:p>
+      <w:pPr>
+        <w:spacing w:after="0"/>
+      </w:pPr>
+      <w:r>
         <w:rPr>
           <w:b/>
         </w:rPr>
-        <w:t>Does it work for other languages?</w:t>
+        <w:t>Do the new smells after a fix cancel the benefit?</w:t>
       </w:r>
     </w:p>
     <w:p>
       <w:r>
-        <w:t>Not yet. The parser, tree-sitter, supports many languages, but the metrics and the refactoring engine are written for Java.</w:t>
+        <w:t>They are a real cost, and I report them: 865 new smells appeared, most often Long Parameter List, mostly from Extract Method. But the targeted smell disappeared in 65% of the cases.</w:t>
+      </w:r>
+    </w:p>
+    <w:p>
+      <w:pPr>
+        <w:spacing w:after="0"/>
+      </w:pPr>
+      <w:r>
+        <w:rPr>
+          <w:b/>
+        </w:rPr>
+        <w:t>How did you review the changes by hand?</w:t>
       </w:r>
     </w:p>
     <w:p>
       <w:r>
+        <w:t>I sampled 20 changes for each of the three fixes, 60 in total, and judged each as acceptable, acceptable after a small edit, or rejected. Extract Method is most of the changes, so the total is weighted by how common each fix is.</w:t>
+      </w:r>
+    </w:p>
+    <w:p>
+      <w:pPr>
+        <w:spacing w:after="0"/>
+      </w:pPr>
+      <w:r>
         <w:rPr>
           <w:b/>
         </w:rPr>
-        <w:t>Is the tool available?</w:t>
+        <w:t>How fast is it? Can it handle a real project?</w:t>
       </w:r>
     </w:p>
     <w:p>
       <w:r>
-        <w:t>Yes, it is open source on GitHub under the MIT license, with a Docker image.</w:t>
+        <w:t>On jsoup, about 35 thousand lines in 199 files, the rules run in about two seconds on a laptop. The whole corpus of hundreds of projects was analyzed the same way.</w:t>
+      </w:r>
+    </w:p>
+    <w:p>
+      <w:pPr>
+        <w:spacing w:after="0"/>
+      </w:pPr>
+      <w:r>
+        <w:rPr>
+          <w:b/>
+        </w:rPr>
+        <w:t>What does a developer actually see in the tool?</w:t>
       </w:r>
     </w:p>
     <w:p>
       <w:r>
+        <w:t>For each finding: the smell, how serious it is, the conditions that fired with the measured values, and where possible a preview of the fix before any file changes. There is also a plain-language mode in Albanian.</w:t>
+      </w:r>
+    </w:p>
+    <w:p>
+      <w:pPr>
+        <w:pStyle w:val="Heading2"/>
+      </w:pPr>
+      <w:r>
+        <w:t>Niveli 4: Recensent i rreptë</w:t>
+      </w:r>
+    </w:p>
+    <w:p>
+      <w:pPr>
+        <w:spacing w:after="0"/>
+      </w:pPr>
+      <w:r>
         <w:rPr>
           <w:b/>
         </w:rPr>
-        <w:t>What is MLCQ?</w:t>
+        <w:t>Isn't choosing the best model on the same predictions optimistic?</w:t>
       </w:r>
     </w:p>
     <w:p>
       <w:r>
-        <w:t>A public dataset by Madeyski and Lewowski, 2020: about fifteen thousand reviews of Java code by twenty-six professional developers, for four smells.</w:t>
+        <w:t>Yes, slightly, and I say so. That is why I report every algorithm: even the weakest one beats the rules on 3 of 4 smells, so the conclusion does not depend on the choice.</w:t>
+      </w:r>
+    </w:p>
+    <w:p>
+      <w:pPr>
+        <w:spacing w:after="0"/>
+      </w:pPr>
+      <w:r>
+        <w:rPr>
+          <w:b/>
+        </w:rPr>
+        <w:t>If reviewers disagree, are your labels reliable at all?</w:t>
       </w:r>
     </w:p>
     <w:p>
       <w:r>
+        <w:t>For Feature Envy, not really: the reviewers' MCC is -0.07, and I report that as a limit. For the other three it is 0.31 to 0.57, so the labels carry real signal, and each label is the average of its reviewers.</w:t>
+      </w:r>
+    </w:p>
+    <w:p>
+      <w:pPr>
+        <w:spacing w:after="0"/>
+      </w:pPr>
+      <w:r>
         <w:rPr>
           <w:b/>
         </w:rPr>
-        <w:t>Did refactoring create new smells?</w:t>
+        <w:t>How can you call a change safe without running tests?</w:t>
       </w:r>
     </w:p>
     <w:p>
       <w:r>
-        <w:t>Yes: 865 new smells appeared, mostly Long Parameter List, because Extract Method passes every input as a parameter. We report them together with the removed smells.</w:t>
+        <w:t>I do not claim that behavior is preserved. I claim two things: the preconditions are proven on the syntax tree, and the result adds no new compile error. In my manual review 1 Extract Method change still seemed to change behavior, which is exactly why I do not claim more.</w:t>
+      </w:r>
+    </w:p>
+    <w:p>
+      <w:pPr>
+        <w:spacing w:after="0"/>
+      </w:pPr>
+      <w:r>
+        <w:rPr>
+          <w:b/>
+        </w:rPr>
+        <w:t>Why tree-sitter, and not a compiler front end that resolves names?</w:t>
       </w:r>
     </w:p>
     <w:p>
       <w:r>
+        <w:t>Tree-sitter is fast, it works on code that does not compile, and it needs no build setup. The price is that names are not resolved, so the engine refuses when a name is ambiguous instead of guessing.</w:t>
+      </w:r>
+    </w:p>
+    <w:p>
+      <w:pPr>
+        <w:spacing w:after="0"/>
+      </w:pPr>
+      <w:r>
         <w:rPr>
           <w:b/>
         </w:rPr>
-        <w:t>How good are the rewrites for a developer?</w:t>
+        <w:t>Could the model just learn size or project style instead of smells?</w:t>
       </w:r>
     </w:p>
     <w:p>
       <w:r>
-        <w:t>I reviewed 60 by hand. After reweighting, 63% are acceptable. Guard Clauses were always acceptable; Introduce Parameter Object never, because it only moves the long list.</w:t>
+        <w:t>Grouping by project stops it from memorizing projects. Size does matter for some smells: for Blob the strongest features are CLOC and NOM, which fits the definition of a class that does too much.</w:t>
+      </w:r>
+    </w:p>
+    <w:p>
+      <w:pPr>
+        <w:spacing w:after="0"/>
+      </w:pPr>
+      <w:r>
+        <w:rPr>
+          <w:b/>
+        </w:rPr>
+        <w:t>How did you handle the imbalance, with so few smelly samples?</w:t>
       </w:r>
     </w:p>
     <w:p>
       <w:r>
+        <w:t>Every model that supports it uses balanced class weights. I did not oversample, because copying rows could cross the project groups and undo the grouping. And the score is MCC, which is not fooled by imbalance.</w:t>
+      </w:r>
+    </w:p>
+    <w:p>
+      <w:pPr>
+        <w:spacing w:after="0"/>
+      </w:pPr>
+      <w:r>
         <w:rPr>
           <w:b/>
         </w:rPr>
-        <w:t>What would you do next?</w:t>
+        <w:t>How do your numbers compare with the literature?</w:t>
       </w:r>
     </w:p>
     <w:p>
       <w:r>
-        <w:t>Run the projects' own tests after each rewrite, add a small symbol resolver to support more refactorings, and let independent reviewers judge the rewrites.</w:t>
+        <w:t>They are in the same range as Madeyski and Lewowski 2023 on the same dataset: for Feature Envy they report 0.31 (FDA) and I get 0.32. They used a random split and tuned models, which usually gives higher numbers, and I grouped by project.</w:t>
+      </w:r>
+    </w:p>
+    <w:p>
+      <w:pPr>
+        <w:spacing w:after="0"/>
+      </w:pPr>
+      <w:r>
+        <w:rPr>
+          <w:b/>
+        </w:rPr>
+        <w:t>Why keep Introduce Parameter Object if none of its changes were acceptable?</w:t>
+      </w:r>
+    </w:p>
+    <w:p>
+      <w:r>
+        <w:t>To report a negative result honestly. It does remove the Long Parameter List smell, but a developer gains nothing, because the long list only moves into a new class.</w:t>
+      </w:r>
+    </w:p>
+    <w:p>
+      <w:pPr>
+        <w:spacing w:after="0"/>
+      </w:pPr>
+      <w:r>
+        <w:rPr>
+          <w:b/>
+        </w:rPr>
+        <w:t>Can someone else reproduce your numbers?</w:t>
+      </w:r>
+    </w:p>
+    <w:p>
+      <w:r>
+        <w:t>Yes. Every number comes from a script and is stored with fixed random seeds and pinned versions, so a clean copy of the project can regenerate every table.</w:t>
+      </w:r>
+    </w:p>
+    <w:p>
+      <w:pPr>
+        <w:spacing w:after="0"/>
+      </w:pPr>
+      <w:r>
+        <w:rPr>
+          <w:b/>
+        </w:rPr>
+        <w:t>Would this work on industrial code, not open source?</w:t>
+      </w:r>
+    </w:p>
+    <w:p>
+      <w:r>
+        <w:t>Probably with recalibration: MLCQ is open-source code, so the thresholds and the models may need new data. That is a limit I state, and the pipeline is scripted so it can be rerun on another dataset.</w:t>
       </w:r>
     </w:p>
     <w:p>
@@ -1812,10 +2268,10 @@
         <w:t>Good morning, everyone.</w:t>
       </w:r>
       <w:r>
-        <w:t xml:space="preserve"> My name is Florent Latifi, and this work comes from my bachelor thesis at UBT, supervised by Altina Salihu.</w:t>
+        <w:t xml:space="preserve"> My name is Florent Latifi. This is my bachelor thesis at UBT, with my supervisor Altina Salihu.</w:t>
       </w:r>
       <w:r>
-        <w:t xml:space="preserve"> In the next ten minutes I will show how we can detect code smells in Java automatically, how accurate that detection really is, and how far we can go in fixing them.</w:t>
+        <w:t xml:space="preserve"> In the next minutes I will show three things: how a tool can find design problems in Java code, how accurate it is, and whether it can also fix them.</w:t>
       </w:r>
     </w:p>
     <w:p>
@@ -1831,37 +2287,31 @@
         <w:t>Every developer knows the class that nobody wants to touch.</w:t>
       </w:r>
       <w:r>
-        <w:t xml:space="preserve"> The program works, but every change takes longer than it should.</w:t>
+        <w:t xml:space="preserve"> The program works, but every small change takes too long.</w:t>
       </w:r>
       <w:r>
-        <w:t xml:space="preserve"> These design problems are called code smells.</w:t>
+        <w:t xml:space="preserve"> We call these design problems code smells.</w:t>
       </w:r>
       <w:r>
-        <w:t xml:space="preserve"> They are not bugs, but they make maintenance expensive.</w:t>
+        <w:t xml:space="preserve"> They are not bugs. They make the code expensive to change.</w:t>
       </w:r>
       <w:r>
-        <w:t xml:space="preserve"> Most tools find them with fixed thresholds.</w:t>
+        <w:t xml:space="preserve"> Most tools use fixed numbers: if a method has more than 30 lines, it is a Long Method.</w:t>
       </w:r>
       <w:r>
-        <w:t xml:space="preserve"> For example, if a method is longer than a certain number of lines, it is a Long Method.</w:t>
+        <w:t xml:space="preserve"> But these numbers come from other projects, and the tools do not fix anything.</w:t>
       </w:r>
       <w:r>
-        <w:t xml:space="preserve"> But these numbers were calibrated on other code, and most tools only point at the problem.</w:t>
+        <w:t xml:space="preserve"> So I asked three questions.</w:t>
       </w:r>
       <w:r>
-        <w:t xml:space="preserve"> They do not fix it.</w:t>
+        <w:t xml:space="preserve"> One: how accurate are the published rules?</w:t>
       </w:r>
       <w:r>
-        <w:t xml:space="preserve"> So we asked three questions.</w:t>
+        <w:t xml:space="preserve"> Two: can machine learning do better?</w:t>
       </w:r>
       <w:r>
-        <w:t xml:space="preserve"> First, how accurate are the published detection rules?</w:t>
-      </w:r>
-      <w:r>
-        <w:t xml:space="preserve"> Second, can machine learning do better with the same metrics?</w:t>
-      </w:r>
-      <w:r>
-        <w:t xml:space="preserve"> And third, can we fix smells automatically without breaking the code?</w:t>
+        <w:t xml:space="preserve"> Three: can a tool fix these smells automatically, without breaking the code?</w:t>
       </w:r>
     </w:p>
     <w:p>
@@ -1874,16 +2324,26 @@
     </w:p>
     <w:p>
       <w:r>
-        <w:t>This study looks at four of them.</w:t>
+        <w:t>In this study I look at four smells.</w:t>
       </w:r>
       <w:r>
-        <w:t xml:space="preserve"> Blob is a class that does too much.</w:t>
+        <w:t xml:space="preserve"> A Blob is a class that does too much.</w:t>
       </w:r>
       <w:r>
-        <w:t xml:space="preserve"> Data Class only holds data and has almost no behavior.</w:t>
+        <w:t xml:space="preserve"> A Data Class only holds data and does almost nothing with it.</w:t>
       </w:r>
       <w:r>
-        <w:t xml:space="preserve"> Long Method is a method that has grown too long, and Feature Envy is a method that uses another class more than its own.</w:t>
+        <w:t xml:space="preserve"> A Long Method is a method that has grown too long.</w:t>
+      </w:r>
+      <w:r>
+        <w:t xml:space="preserve"> And Feature Envy is a method that works more with another class than with its own.</w:t>
+      </w:r>
+      <w:r>
+        <w:rPr>
+          <w:i/>
+          <w:color w:val="2F6F45"/>
+        </w:rPr>
+        <w:t xml:space="preserve"> In the drawings, a box is a class, a blue line is a method, and a gray dot is a piece of data.</w:t>
       </w:r>
     </w:p>
     <w:p>
@@ -1896,38 +2356,32 @@
     </w:p>
     <w:p>
       <w:r>
-        <w:t>To answer these questions, I built a tool called JavaSmell.</w:t>
+        <w:t>To answer the three questions, I built a tool called JavaSmell.</w:t>
       </w:r>
       <w:r>
-        <w:t xml:space="preserve"> It reads Java code and measures 26 metrics for every class and method.</w:t>
+        <w:t xml:space="preserve"> It reads Java code and measures 26 numbers for every class and method, like the number of lines or how complex the code is.</w:t>
       </w:r>
       <w:r>
-        <w:t xml:space="preserve"> On top of these metrics there are three approaches.</w:t>
+        <w:t xml:space="preserve"> Part A uses 8 rules from well-known books and papers.</w:t>
       </w:r>
       <w:r>
-        <w:t xml:space="preserve"> A uses 8 detection strategies from the literature, such as Lanza and Marinescu and Fowler.</w:t>
+        <w:t xml:space="preserve"> Part B uses machine learning on the same numbers.</w:t>
       </w:r>
       <w:r>
-        <w:t xml:space="preserve"> B trains machine learning classifiers on the same metrics.</w:t>
+        <w:t xml:space="preserve"> Part C fixes the code, but only when it can prove that the change is safe.</w:t>
       </w:r>
       <w:r>
-        <w:t xml:space="preserve"> And C is a refactoring engine.</w:t>
-      </w:r>
-      <w:r>
-        <w:t xml:space="preserve"> It rewrites code only when it can prove its preconditions from the syntax tree, and then it checks the result with the Java compiler.</w:t>
+        <w:t xml:space="preserve"> Then the Java compiler checks the result.</w:t>
       </w:r>
       <w:r>
         <w:rPr>
           <w:i/>
           <w:color w:val="2F6F45"/>
         </w:rPr>
-        <w:t xml:space="preserve"> Every detection also shows the conditions it checked, so a developer can see why a class was flagged, not only that it was.</w:t>
+        <w:t xml:space="preserve"> Every finding also says why, for example: this method has 53 lines, and the limit is 30.</w:t>
       </w:r>
       <w:r>
-        <w:t xml:space="preserve"> On the right you can see the web interface.</w:t>
-      </w:r>
-      <w:r>
-        <w:t xml:space="preserve"> It also has a plain-language mode for people without a technical background.</w:t>
+        <w:t xml:space="preserve"> On the right you see the web interface, in plain Albanian, for people who are not experts.</w:t>
       </w:r>
     </w:p>
     <w:p>
@@ -1940,25 +2394,29 @@
     </w:p>
     <w:p>
       <w:r>
-        <w:t>For a fair test, we need labels from people.</w:t>
+        <w:t>To test the tool fairly, I need answers from real people.</w:t>
       </w:r>
       <w:r>
-        <w:t xml:space="preserve"> We used MLCQ, a public dataset where professional developers reviewed real open-source Java code.</w:t>
+        <w:t xml:space="preserve"> I used MLCQ, a public dataset where professional developers judged real Java code.</w:t>
       </w:r>
       <w:r>
-        <w:t xml:space="preserve"> After matching the samples to our tool, we have 9,046 labeled samples from 512 repositories, for four smells.</w:t>
+        <w:t xml:space="preserve"> In total I have 9,046 pieces of code from 512 open-source projects.</w:t>
       </w:r>
       <w:r>
-        <w:t xml:space="preserve"> One important detail is how we split the data.</w:t>
+        <w:t xml:space="preserve"> A model is never tested on a project it has already seen: it learns from four groups of projects and is tested on the fifth.</w:t>
       </w:r>
       <w:r>
-        <w:t xml:space="preserve"> Code from the same project looks very similar, so we grouped the data by repository: a model is never tested on a project it learned from.</w:t>
+        <w:rPr>
+          <w:i/>
+          <w:color w:val="2F6F45"/>
+        </w:rPr>
+        <w:t xml:space="preserve"> Code from the same project looks very similar, so testing on a project it has seen would be like an exam where you already know the answers.</w:t>
       </w:r>
       <w:r>
-        <w:t xml:space="preserve"> And we report the Matthews correlation coefficient, MCC.</w:t>
+        <w:t xml:space="preserve"> To score the results I use MCC, not simple accuracy.</w:t>
       </w:r>
       <w:r>
-        <w:t xml:space="preserve"> Most samples are clean, so simple accuracy would look very good even for a detector that never fires.</w:t>
+        <w:t xml:space="preserve"> On Feature Envy, a detector that always says “clean” is 93 percent accurate, but it is useless. Its MCC is zero.</w:t>
       </w:r>
     </w:p>
     <w:p>
@@ -1974,39 +2432,36 @@
         <w:t>Here are the main results.</w:t>
       </w:r>
       <w:r>
-        <w:t xml:space="preserve"> The gray bars are the published rules, and the blue bars are the best machine learning model for each smell.</w:t>
+        <w:t xml:space="preserve"> Gray is the published rules, blue is machine learning.</w:t>
       </w:r>
       <w:r>
-        <w:t xml:space="preserve"> The rules are often correct when they fire, but they catch only 17 to 47 percent of the smells that developers marked.</w:t>
+        <w:t xml:space="preserve"> Higher is better: zero means guessing, one means perfect.</w:t>
       </w:r>
       <w:r>
-        <w:t xml:space="preserve"> The models are better on all four smells, with MCC from 0.32 to 0.72.</w:t>
+        <w:t xml:space="preserve"> The rules are usually right when they raise an alarm, but out of every 100 real smells, they find only 17 to 47.</w:t>
       </w:r>
       <w:r>
-        <w:t xml:space="preserve"> Out of every 100 smells, they find 30 to 83; the price is usually more false alarms.</w:t>
+        <w:t xml:space="preserve"> Machine learning is better on all four smells. It finds 30 to 83 out of 100, but usually with more false alarms.</w:t>
       </w:r>
       <w:r>
-        <w:t xml:space="preserve"> We also computed 95 percent confidence intervals by resampling repositories.</w:t>
+        <w:t xml:space="preserve"> For Blob, Data Class and Long Method, the improvement is real, not luck.</w:t>
       </w:r>
       <w:r>
-        <w:t xml:space="preserve"> The improvement is clearly above zero for Blob, Data Class and Long Method.</w:t>
-      </w:r>
-      <w:r>
-        <w:t xml:space="preserve"> For Feature Envy, the difference could be chance.</w:t>
+        <w:t xml:space="preserve"> For Feature Envy, it could be luck.</w:t>
       </w:r>
       <w:r>
         <w:rPr>
           <w:i/>
           <w:color w:val="2F6F45"/>
         </w:rPr>
-        <w:t xml:space="preserve"> We also compared with PMD, a popular open-source analyzer, on the same samples.</w:t>
+        <w:t xml:space="preserve"> I checked this by repeating the calculation 2,000 times on random samples of the projects.</w:t>
       </w:r>
       <w:r>
         <w:rPr>
           <w:i/>
           <w:color w:val="2F6F45"/>
         </w:rPr>
-        <w:t xml:space="preserve"> Once the confidence interval is considered, PMD is never ahead, and for Long Method our rules are clearly better.</w:t>
+        <w:t xml:space="preserve"> I also compared with PMD, a popular free tool: it was never better than my rules.</w:t>
       </w:r>
     </w:p>
     <w:p>
@@ -2022,39 +2477,29 @@
         <w:t>Why is Feature Envy so hard?</w:t>
       </w:r>
       <w:r>
-        <w:t xml:space="preserve"> We measured how much the human reviewers agree with each other.</w:t>
+        <w:t xml:space="preserve"> I looked at code that two developers judged, and checked how often they agree.</w:t>
       </w:r>
       <w:r>
-        <w:t xml:space="preserve"> For Blob, Data Class and Long Method, two reviewers agree only moderately.</w:t>
+        <w:t xml:space="preserve"> For Blob, Data Class and Long Method, they agree only partly.</w:t>
       </w:r>
       <w:r>
-        <w:t xml:space="preserve"> For Feature Envy, they agree no better than chance.</w:t>
+        <w:t xml:space="preserve"> For Feature Envy, they agree no more than a coin flip.</w:t>
       </w:r>
       <w:r>
         <w:rPr>
           <w:i/>
           <w:color w:val="2F6F45"/>
         </w:rPr>
-        <w:t xml:space="preserve"> For Feature Envy, their MCC is -0.07, practically zero.</w:t>
-      </w:r>
-      <w:r>
-        <w:rPr>
-          <w:i/>
-          <w:color w:val="2F6F45"/>
-        </w:rPr>
-        <w:t xml:space="preserve"> This matches the previous slide: Feature Envy is where the model could not clearly beat the rules.</w:t>
+        <w:t xml:space="preserve"> Their score is -0.07, practically zero.</w:t>
       </w:r>
       <w:r>
         <w:t xml:space="preserve"> So the problem is not only the algorithm.</w:t>
       </w:r>
       <w:r>
-        <w:t xml:space="preserve"> It is the definition of the smell itself.</w:t>
+        <w:t xml:space="preserve"> If experts do not agree on what a smell is, no tool can learn it well.</w:t>
       </w:r>
       <w:r>
-        <w:t xml:space="preserve"> If experts do not agree on what a smell is, no detector can learn it well.</w:t>
-      </w:r>
-      <w:r>
-        <w:t xml:space="preserve"> For me, this is the main lesson of the detection part.</w:t>
+        <w:t xml:space="preserve"> For me, this is the most important lesson of the first part.</w:t>
       </w:r>
     </w:p>
     <w:p>
@@ -2067,49 +2512,52 @@
     </w:p>
     <w:p>
       <w:r>
-        <w:t>Now the refactoring engine.</w:t>
+        <w:t>Now the third question: can we fix smells automatically?</w:t>
       </w:r>
       <w:r>
-        <w:t xml:space="preserve"> It supports three transformations: Extract Method, Replace Nested Conditional with Guard Clauses, and Introduce Parameter Object.</w:t>
+        <w:t xml:space="preserve"> The tool knows three fixes: split a long method, turn a big if into an early exit, and group many parameters into one object.</w:t>
       </w:r>
       <w:r>
-        <w:t xml:space="preserve"> On the whole corpus it found 15,800 sites and rewrote 3,532 of them, which is 22 percent.</w:t>
+        <w:t xml:space="preserve"> In all the projects, it found 15,800 places where a fix could apply.</w:t>
       </w:r>
       <w:r>
-        <w:t xml:space="preserve"> The rest were refused, each with a reason.</w:t>
+        <w:t xml:space="preserve"> It changed 3,532 of them, about 22 percent.</w:t>
+      </w:r>
+      <w:r>
+        <w:t xml:space="preserve"> It refused the rest, because it could not prove the change was safe, and it always says why.</w:t>
+      </w:r>
+      <w:r>
+        <w:t xml:space="preserve"> For me, a refusal is a good result, not a failure.</w:t>
       </w:r>
       <w:r>
         <w:rPr>
           <w:i/>
           <w:color w:val="2F6F45"/>
         </w:rPr>
-        <w:t xml:space="preserve"> In 45 percent of the sites, the reason is simply that the code does not have the shape the transformation needs.</w:t>
+        <w:t xml:space="preserve"> In 45 percent of the places, the code simply does not have the right shape for the fix.</w:t>
       </w:r>
       <w:r>
-        <w:t xml:space="preserve"> For us, refusing is a correct result, not a failure.</w:t>
+        <w:t xml:space="preserve"> After a change, the smell disappeared in 65 percent of the cases.</w:t>
       </w:r>
       <w:r>
-        <w:t xml:space="preserve"> After rewriting, the smell disappeared in 65 percent of the cases.</w:t>
+        <w:t xml:space="preserve"> Only 1.6 percent of the changes added a new compile error, and those are never written to the code.</w:t>
       </w:r>
       <w:r>
-        <w:t xml:space="preserve"> Only 1.6 percent of the rewrites introduced a new type of compilation error, and those never reach the code, because the tool only writes verified rewrites.</w:t>
-      </w:r>
-      <w:r>
-        <w:t xml:space="preserve"> I also read 60 rewrites by hand: after reweighting, about 63 percent would be acceptable to a developer.</w:t>
+        <w:t xml:space="preserve"> By checking 60 changes by hand, I estimate that about 63 percent would be acceptable to a developer.</w:t>
       </w:r>
       <w:r>
         <w:rPr>
           <w:i/>
           <w:color w:val="2F6F45"/>
         </w:rPr>
-        <w:t xml:space="preserve"> Refactoring can also create new smells: 865 appeared after rewriting, most often Long Parameter List, because Extract Method passes every input as a parameter.</w:t>
+        <w:t xml:space="preserve"> Fixes can also create new smells: 865 appeared, most often Long Parameter List.</w:t>
       </w:r>
       <w:r>
         <w:rPr>
           <w:i/>
           <w:color w:val="2F6F45"/>
         </w:rPr>
-        <w:t xml:space="preserve"> In that review, Guard Clauses were always acceptable, and Introduce Parameter Object never, because it only moves the long list into a new class.</w:t>
+        <w:t xml:space="preserve"> Guard Clauses were always acceptable; Introduce Parameter Object never, because it only moves the long list.</w:t>
       </w:r>
     </w:p>
     <w:p>
@@ -2122,30 +2570,30 @@
     </w:p>
     <w:p>
       <w:r>
-        <w:t>Here is one real example from Apache Geode.</w:t>
+        <w:t>Here is one real example, from the Apache Geode project.</w:t>
       </w:r>
       <w:r>
-        <w:t xml:space="preserve"> Before, the whole method is wrapped in one if statement, so everything is nested deeply.</w:t>
+        <w:t xml:space="preserve"> Before: the whole method is inside one big if, so all the code is pushed to the right.</w:t>
       </w:r>
       <w:r>
-        <w:t xml:space="preserve"> After the rewrite, the condition becomes a guard clause with an early return, and the rest of the method moves one level up.</w:t>
+        <w:t xml:space="preserve"> After: the condition becomes an early return, and the rest of the code moves one level up.</w:t>
       </w:r>
       <w:r>
         <w:rPr>
           <w:i/>
           <w:color w:val="2F6F45"/>
         </w:rPr>
-        <w:t xml:space="preserve"> The engine accepts only exactly this shape: a void method whose whole body is one if statement, without else.</w:t>
+        <w:t xml:space="preserve"> The tool only does this when the method returns nothing and its whole body is one if, without else.</w:t>
       </w:r>
       <w:r>
         <w:rPr>
           <w:i/>
           <w:color w:val="2F6F45"/>
         </w:rPr>
-        <w:t xml:space="preserve"> It also wraps the condition in a not, instead of inverting it by hand, so it stays correct for every condition.</w:t>
+        <w:t xml:space="preserve"> It writes the condition as “not” the original, so the meaning stays exactly the same.</w:t>
       </w:r>
       <w:r>
-        <w:t xml:space="preserve"> The rewrite passed the compiler check, and in my review it was acceptable as it is.</w:t>
+        <w:t xml:space="preserve"> The result compiles, and in my review it was acceptable without any change.</w:t>
       </w:r>
     </w:p>
     <w:p>
@@ -2158,42 +2606,45 @@
     </w:p>
     <w:p>
       <w:r>
-        <w:t>To be honest about the limits: compiling is not the same as behaving the same.</w:t>
+        <w:t>To be honest about the limits: code that compiles does not always behave the same.</w:t>
       </w:r>
       <w:r>
-        <w:t xml:space="preserve"> We did not run the projects' test suites, so behavior preservation is future work.</w:t>
+        <w:t xml:space="preserve"> I could not run the projects' own tests, so checking the behavior is future work.</w:t>
       </w:r>
       <w:r>
-        <w:t xml:space="preserve"> We also used one dataset, four smells, and only Java.</w:t>
+        <w:t xml:space="preserve"> Also: one dataset, four smells, and only Java.</w:t>
       </w:r>
       <w:r>
         <w:rPr>
           <w:i/>
           <w:color w:val="2F6F45"/>
         </w:rPr>
-        <w:t xml:space="preserve"> And the best model was chosen on the same predictions it is scored on, so its numbers are slightly optimistic.</w:t>
+        <w:t xml:space="preserve"> And I picked the best model using the same results I report, so its numbers are a little optimistic.</w:t>
       </w:r>
       <w:r>
         <w:rPr>
           <w:i/>
           <w:color w:val="2F6F45"/>
         </w:rPr>
-        <w:t xml:space="preserve"> As next steps, I would add a small symbol resolver to support more refactorings, and ask independent reviewers to judge the rewrites.</w:t>
+        <w:t xml:space="preserve"> Next, I want to run the projects' tests after each change, and ask other developers to judge the changes.</w:t>
       </w:r>
       <w:r>
-        <w:t xml:space="preserve"> To summarize: learned boundaries beat fixed thresholds.</w:t>
+        <w:t xml:space="preserve"> So, the three answers.</w:t>
       </w:r>
       <w:r>
-        <w:t xml:space="preserve"> Safe automatic refactoring is possible, but narrow, and it should be reviewed by a developer.</w:t>
+        <w:t xml:space="preserve"> One: the published rules are precise, but they miss most smells.</w:t>
       </w:r>
       <w:r>
-        <w:t xml:space="preserve"> The tool is open source, and every number in this talk can be regenerated with a script.</w:t>
+        <w:t xml:space="preserve"> Two: machine learning on the same numbers does better.</w:t>
       </w:r>
       <w:r>
-        <w:t xml:space="preserve"> Thank you.</w:t>
+        <w:t xml:space="preserve"> Three: automatic fixing is possible and safe, but only for a small part of the code.</w:t>
       </w:r>
       <w:r>
-        <w:t xml:space="preserve"> I am happy to take your questions.</w:t>
+        <w:t xml:space="preserve"> Everything is open source, and every number here can be recreated with a script.</w:t>
+      </w:r>
+      <w:r>
+        <w:t xml:space="preserve"> Thank you. I am happy to answer your questions.</w:t>
       </w:r>
     </w:p>
     <w:sectPr>

</xml_diff>